<commit_message>
Update audited manuscript documents
Update main text, online appendix, and referenced Brexit tuition documents in the Manuscript folder.
</commit_message>
<xml_diff>
--- a/Manuscript/For reference/Brexit_tuition_revised.docx
+++ b/Manuscript/For reference/Brexit_tuition_revised.docx
@@ -1,6 +1,6 @@
 
 <file path=word/document.xml><?xml version="1.0" encoding="utf-8"?>
-<w:document xmlns:wpc="http://schemas.microsoft.com/office/word/2010/wordprocessingCanvas" xmlns:cx="http://schemas.microsoft.com/office/drawing/2014/chartex" xmlns:cx1="http://schemas.microsoft.com/office/drawing/2015/9/8/chartex" xmlns:cx2="http://schemas.microsoft.com/office/drawing/2015/10/21/chartex" xmlns:cx3="http://schemas.microsoft.com/office/drawing/2016/5/9/chartex" xmlns:cx4="http://schemas.microsoft.com/office/drawing/2016/5/10/chartex" xmlns:cx5="http://schemas.microsoft.com/office/drawing/2016/5/11/chartex" xmlns:cx6="http://schemas.microsoft.com/office/drawing/2016/5/12/chartex" xmlns:cx7="http://schemas.microsoft.com/office/drawing/2016/5/13/chartex" xmlns:cx8="http://schemas.microsoft.com/office/drawing/2016/5/14/chartex" xmlns:mc="http://schemas.openxmlformats.org/markup-compatibility/2006" xmlns:aink="http://schemas.microsoft.com/office/drawing/2016/ink" xmlns:am3d="http://schemas.microsoft.com/office/drawing/2017/model3d" xmlns:o="urn:schemas-microsoft-com:office:office" xmlns:r="http://schemas.openxmlformats.org/officeDocument/2006/relationships" xmlns:m="http://schemas.openxmlformats.org/officeDocument/2006/math" xmlns:v="urn:schemas-microsoft-com:vml" xmlns:wp14="http://schemas.microsoft.com/office/word/2010/wordprocessingDrawing" xmlns:wp="http://schemas.openxmlformats.org/drawingml/2006/wordprocessingDrawing" xmlns:w10="urn:schemas-microsoft-com:office:word" xmlns:w="http://schemas.openxmlformats.org/wordprocessingml/2006/main" xmlns:w14="http://schemas.microsoft.com/office/word/2010/wordml" xmlns:w15="http://schemas.microsoft.com/office/word/2012/wordml" xmlns:w16cid="http://schemas.microsoft.com/office/word/2016/wordml/cid" xmlns:w16se="http://schemas.microsoft.com/office/word/2015/wordml/symex" xmlns:wpg="http://schemas.microsoft.com/office/word/2010/wordprocessingGroup" xmlns:wpi="http://schemas.microsoft.com/office/word/2010/wordprocessingInk" xmlns:wne="http://schemas.microsoft.com/office/word/2006/wordml" xmlns:wps="http://schemas.microsoft.com/office/word/2010/wordprocessingShape" mc:Ignorable="w14 w15 w16se w16cid wp14">
+<w:document xmlns:wpc="http://schemas.microsoft.com/office/word/2010/wordprocessingCanvas" xmlns:cx="http://schemas.microsoft.com/office/drawing/2014/chartex" xmlns:cx1="http://schemas.microsoft.com/office/drawing/2015/9/8/chartex" xmlns:cx2="http://schemas.microsoft.com/office/drawing/2015/10/21/chartex" xmlns:cx3="http://schemas.microsoft.com/office/drawing/2016/5/9/chartex" xmlns:cx4="http://schemas.microsoft.com/office/drawing/2016/5/10/chartex" xmlns:cx5="http://schemas.microsoft.com/office/drawing/2016/5/11/chartex" xmlns:cx6="http://schemas.microsoft.com/office/drawing/2016/5/12/chartex" xmlns:cx7="http://schemas.microsoft.com/office/drawing/2016/5/13/chartex" xmlns:cx8="http://schemas.microsoft.com/office/drawing/2016/5/14/chartex" xmlns:mc="http://schemas.openxmlformats.org/markup-compatibility/2006" xmlns:aink="http://schemas.microsoft.com/office/drawing/2016/ink" xmlns:am3d="http://schemas.microsoft.com/office/drawing/2017/model3d" xmlns:o="urn:schemas-microsoft-com:office:office" xmlns:oel="http://schemas.microsoft.com/office/2019/extlst" xmlns:r="http://schemas.openxmlformats.org/officeDocument/2006/relationships" xmlns:m="http://schemas.openxmlformats.org/officeDocument/2006/math" xmlns:v="urn:schemas-microsoft-com:vml" xmlns:wp14="http://schemas.microsoft.com/office/word/2010/wordprocessingDrawing" xmlns:wp="http://schemas.openxmlformats.org/drawingml/2006/wordprocessingDrawing" xmlns:w10="urn:schemas-microsoft-com:office:word" xmlns:w="http://schemas.openxmlformats.org/wordprocessingml/2006/main" xmlns:w14="http://schemas.microsoft.com/office/word/2010/wordml" xmlns:w15="http://schemas.microsoft.com/office/word/2012/wordml" xmlns:w16cex="http://schemas.microsoft.com/office/word/2018/wordml/cex" xmlns:w16cid="http://schemas.microsoft.com/office/word/2016/wordml/cid" xmlns:w16="http://schemas.microsoft.com/office/word/2018/wordml" xmlns:w16du="http://schemas.microsoft.com/office/word/2023/wordml/word16du" xmlns:w16sdtdh="http://schemas.microsoft.com/office/word/2020/wordml/sdtdatahash" xmlns:w16sdtfl="http://schemas.microsoft.com/office/word/2024/wordml/sdtformatlock" xmlns:w16se="http://schemas.microsoft.com/office/word/2015/wordml/symex" xmlns:wpg="http://schemas.microsoft.com/office/word/2010/wordprocessingGroup" xmlns:wpi="http://schemas.microsoft.com/office/word/2010/wordprocessingInk" xmlns:wne="http://schemas.microsoft.com/office/word/2006/wordml" xmlns:wps="http://schemas.microsoft.com/office/word/2010/wordprocessingShape" mc:Ignorable="w14 w15 w16se w16cid w16 w16cex w16sdtdh w16sdtfl w16du wp14">
   <w:body>
     <w:p>
       <w:pPr>
@@ -7442,7 +7442,7 @@
         </w:rPr>
         <w:lastRenderedPageBreak/>
         <w:drawing>
-          <wp:inline distT="0" distB="0" distL="0" distR="0">
+          <wp:inline distT="0" distB="0" distL="0" distR="0" wp14:anchorId="50A66C53" wp14:editId="1B9697AD">
             <wp:extent cx="5727700" cy="3539066"/>
             <wp:effectExtent l="0" t="0" r="0" b="0"/>
             <wp:docPr id="22" name="Picture"/>
@@ -7612,21 +7612,7 @@
         <w:rPr>
           <w:rFonts w:ascii="Times New Roman" w:hAnsi="Times New Roman" w:cs="Times New Roman"/>
         </w:rPr>
-        <w:t xml:space="preserve"> suggests the UK system did not become less appealing because of migration concerns, and if </w:t>
-      </w:r>
-      <w:proofErr w:type="gramStart"/>
-      <w:r>
-        <w:rPr>
-          <w:rFonts w:ascii="Times New Roman" w:hAnsi="Times New Roman" w:cs="Times New Roman"/>
-        </w:rPr>
-        <w:t>anything</w:t>
-      </w:r>
-      <w:proofErr w:type="gramEnd"/>
-      <w:r>
-        <w:rPr>
-          <w:rFonts w:ascii="Times New Roman" w:hAnsi="Times New Roman" w:cs="Times New Roman"/>
-        </w:rPr>
-        <w:t xml:space="preserve"> candidates were more motivated to apply.</w:t>
+        <w:t xml:space="preserve"> suggests the UK system did not become less appealing because of migration concerns, and if anything candidates were more motivated to apply.</w:t>
       </w:r>
     </w:p>
     <w:p>
@@ -7802,7 +7788,7 @@
           <w:noProof/>
         </w:rPr>
         <w:drawing>
-          <wp:inline distT="0" distB="0" distL="0" distR="0">
+          <wp:inline distT="0" distB="0" distL="0" distR="0" wp14:anchorId="7B45946C" wp14:editId="375BE580">
             <wp:extent cx="5727700" cy="4091214"/>
             <wp:effectExtent l="0" t="0" r="0" b="0"/>
             <wp:docPr id="25" name="Picture"/>
@@ -8703,17 +8689,9 @@
           <w:rPr>
             <w:rFonts w:ascii="Times New Roman" w:hAnsi="Times New Roman" w:cs="Times New Roman"/>
           </w:rPr>
-          <w:t xml:space="preserve">the applicant </w:t>
-        </w:r>
-        <w:proofErr w:type="gramStart"/>
-        <w:r>
-          <w:rPr>
-            <w:rFonts w:ascii="Times New Roman" w:hAnsi="Times New Roman" w:cs="Times New Roman"/>
-          </w:rPr>
-          <w:t>count</w:t>
+          <w:t>the applicant count</w:t>
         </w:r>
       </w:ins>
-      <w:proofErr w:type="gramEnd"/>
       <w:r>
         <w:rPr>
           <w:rFonts w:ascii="Times New Roman" w:hAnsi="Times New Roman" w:cs="Times New Roman"/>
@@ -11941,21 +11919,7 @@
         <w:rPr>
           <w:rFonts w:ascii="Times New Roman" w:hAnsi="Times New Roman" w:cs="Times New Roman"/>
         </w:rPr>
-        <w:t xml:space="preserve"> is 0.875. Clifton-</w:t>
-      </w:r>
-      <w:proofErr w:type="spellStart"/>
-      <w:r>
-        <w:rPr>
-          <w:rFonts w:ascii="Times New Roman" w:hAnsi="Times New Roman" w:cs="Times New Roman"/>
-        </w:rPr>
-        <w:t>Sprigg</w:t>
-      </w:r>
-      <w:proofErr w:type="spellEnd"/>
-      <w:r>
-        <w:rPr>
-          <w:rFonts w:ascii="Times New Roman" w:hAnsi="Times New Roman" w:cs="Times New Roman"/>
-        </w:rPr>
-        <w:t xml:space="preserve"> </w:t>
+        <w:t xml:space="preserve"> is 0.875. Clifton-Sprigg </w:t>
       </w:r>
       <w:ins w:id="201" w:author="Stoycho Rusinov" w:date="2026-08-08T15:23:00Z">
         <w:r>
@@ -12734,7 +12698,7 @@
           <w:noProof/>
         </w:rPr>
         <w:drawing>
-          <wp:inline distT="0" distB="0" distL="0" distR="0">
+          <wp:inline distT="0" distB="0" distL="0" distR="0" wp14:anchorId="5B80397D" wp14:editId="612A5004">
             <wp:extent cx="5727700" cy="4091214"/>
             <wp:effectExtent l="0" t="0" r="0" b="0"/>
             <wp:docPr id="30" name="Picture"/>
@@ -13287,7 +13251,7 @@
           <w:noProof/>
         </w:rPr>
         <w:drawing>
-          <wp:inline distT="0" distB="0" distL="0" distR="0">
+          <wp:inline distT="0" distB="0" distL="0" distR="0" wp14:anchorId="2F4CA0F7" wp14:editId="29C7F2B5">
             <wp:extent cx="5727700" cy="3226193"/>
             <wp:effectExtent l="0" t="0" r="0" b="0"/>
             <wp:docPr id="33" name="Picture"/>
@@ -13608,7 +13572,7 @@
           <w:noProof/>
         </w:rPr>
         <w:drawing>
-          <wp:inline distT="0" distB="0" distL="0" distR="0">
+          <wp:inline distT="0" distB="0" distL="0" distR="0" wp14:anchorId="76B6CE76" wp14:editId="5E1B745C">
             <wp:extent cx="5727700" cy="4091214"/>
             <wp:effectExtent l="0" t="0" r="0" b="0"/>
             <wp:docPr id="36" name="Picture"/>
@@ -13654,6 +13618,7 @@
       <w:pPr>
         <w:spacing w:line="360" w:lineRule="auto"/>
         <w:rPr>
+          <w:ins w:id="225" w:author="Microsoft Office User" w:date="2026-08-09T17:36:00Z" w16du:dateUtc="2026-08-09T14:36:00Z"/>
           <w:rFonts w:ascii="Times New Roman" w:hAnsi="Times New Roman" w:cs="Times New Roman"/>
         </w:rPr>
       </w:pPr>
@@ -13671,6 +13636,20 @@
           <w:rFonts w:ascii="Times New Roman" w:hAnsi="Times New Roman" w:cs="Times New Roman"/>
         </w:rPr>
       </w:pPr>
+    </w:p>
+    <w:p>
+      <w:pPr>
+        <w:spacing w:line="360" w:lineRule="auto"/>
+        <w:ind w:firstLine="720"/>
+        <w:rPr>
+          <w:rFonts w:ascii="Times New Roman" w:hAnsi="Times New Roman" w:cs="Times New Roman"/>
+        </w:rPr>
+        <w:pPrChange w:id="226" w:author="Microsoft Office User" w:date="2026-08-09T17:36:00Z" w16du:dateUtc="2026-08-09T14:36:00Z">
+          <w:pPr>
+            <w:spacing w:line="360" w:lineRule="auto"/>
+          </w:pPr>
+        </w:pPrChange>
+      </w:pPr>
       <w:r>
         <w:rPr>
           <w:rFonts w:ascii="Times New Roman" w:hAnsi="Times New Roman" w:cs="Times New Roman"/>
@@ -13697,7 +13676,6 @@
         <w:rPr>
           <w:rFonts w:ascii="Times New Roman" w:hAnsi="Times New Roman" w:cs="Times New Roman"/>
         </w:rPr>
-        <w:lastRenderedPageBreak/>
         <w:t>The COVID-specific ATT coefficients run from −0.42 (down from −0.32) for Malta to −2.39 (down from −2.03) for Lithuania. Excluding Portugal for its data issue, the post-COVID coefficients are 2% to 42% larger in absolute magnitude. This contradicts a COVID-driven or mobility-attraction story and implies UK higher education grew steadily less popular among EU students until the system reached a stable equilibrium.</w:t>
       </w:r>
     </w:p>
@@ -13715,7 +13693,7 @@
         <w:rPr>
           <w:rFonts w:ascii="Times New Roman" w:hAnsi="Times New Roman" w:cs="Times New Roman"/>
         </w:rPr>
-        <w:pPrChange w:id="225" w:author="Stoycho Rusinov" w:date="2026-08-08T15:23:00Z">
+        <w:pPrChange w:id="227" w:author="Stoycho Rusinov" w:date="2026-08-08T15:23:00Z">
           <w:pPr>
             <w:numPr>
               <w:numId w:val="3"/>
@@ -16026,14 +16004,14 @@
         <w:rPr>
           <w:rFonts w:ascii="Times New Roman" w:hAnsi="Times New Roman" w:cs="Times New Roman"/>
         </w:rPr>
-        <w:t xml:space="preserve"> Models (I) through (V) are estimated with the standard TWFE estimator. The data is sourced from the World Bank API resources where Model (I) uses the full panel of 520 observations (52 countries over the 2016 to 2025 window), while the specifications with </w:t>
+        <w:t xml:space="preserve"> Models (I) through (V) are estimated with the standard TWFE estimator. The data is sourced from the World Bank API resources where Model (I) uses the full panel of 520 </w:t>
       </w:r>
       <w:r>
         <w:rPr>
           <w:rFonts w:ascii="Times New Roman" w:hAnsi="Times New Roman" w:cs="Times New Roman"/>
         </w:rPr>
         <w:lastRenderedPageBreak/>
-        <w:t xml:space="preserve">World Bank controls (Models II to V) use 468 observations (52 countries over the 2016 to 2024 window), because the World Bank PPP GDP series carries no 2025 value so those country-years drop out. The c_log variables are demeaned before being included in the regression so the interactions with the ATT in model (V) will be comparable. The formula used for the demeaning was </w:t>
+        <w:t xml:space="preserve">observations (52 countries over the 2016 to 2025 window), while the specifications with World Bank controls (Models II to V) use 468 observations (52 countries over the 2016 to 2024 window), because the World Bank PPP GDP series carries no 2025 value so those country-years drop out. The c_log variables are demeaned before being included in the regression so the interactions with the ATT in model (V) will be comparable. The formula used for the demeaning was </w:t>
       </w:r>
       <m:oMath>
         <m:r>
@@ -16154,7 +16132,7 @@
         </w:rPr>
         <w:t xml:space="preserve"> removing the </w:t>
       </w:r>
-      <w:del w:id="226" w:author="Stoycho Rusinov" w:date="2026-08-08T15:23:00Z">
+      <w:del w:id="228" w:author="Stoycho Rusinov" w:date="2026-08-08T15:23:00Z">
         <w:r>
           <w:rPr>
             <w:rFonts w:ascii="Times New Roman" w:hAnsi="Times New Roman" w:cs="Times New Roman"/>
@@ -16162,7 +16140,7 @@
           <w:delText>entir3e</w:delText>
         </w:r>
       </w:del>
-      <w:ins w:id="227" w:author="Stoycho Rusinov" w:date="2026-08-08T15:23:00Z">
+      <w:ins w:id="229" w:author="Stoycho Rusinov" w:date="2026-08-08T15:23:00Z">
         <w:r>
           <w:rPr>
             <w:rFonts w:ascii="Times New Roman" w:hAnsi="Times New Roman" w:cs="Times New Roman"/>
@@ -16467,14 +16445,14 @@
         <w:rPr>
           <w:rFonts w:ascii="Times New Roman" w:hAnsi="Times New Roman" w:cs="Times New Roman"/>
         </w:rPr>
-        <w:t xml:space="preserve">. That is 10.5 percent of the £9,250 principal, and under our baseline calibration it corresponds </w:t>
+        <w:t xml:space="preserve">. </w:t>
       </w:r>
       <w:r>
         <w:rPr>
           <w:rFonts w:ascii="Times New Roman" w:hAnsi="Times New Roman" w:cs="Times New Roman"/>
         </w:rPr>
         <w:lastRenderedPageBreak/>
-        <w:t>to an expected graduate wage of about £18,250 a year. Therefore, the estimates are equal only for an applicant whose income-contingent loan was worth about a tenth of its face value in present-value terms.</w:t>
+        <w:t>That is 10.5 percent of the £9,250 principal, and under our baseline calibration it corresponds to an expected graduate wage of about £18,250 a year. Therefore, the estimates are equal only for an applicant whose income-contingent loan was worth about a tenth of its face value in present-value terms.</w:t>
       </w:r>
     </w:p>
     <w:p>
@@ -16491,7 +16469,7 @@
         </w:rPr>
         <w:t xml:space="preserve">Table 3 also reports regressions that relate the magnitude of the Brexit demand shock to country-level economic characteristics. Across all specifications, the baseline effect remains large, negative, and statistically significant, showing negligible change when additional controls were added. At the same time, there is clear evidence of heterogeneity. The interaction between the Brexit treatment and GDP per capita is positive and statistically significant, indicating that higher-income countries experience smaller declines in </w:t>
       </w:r>
-      <w:del w:id="228" w:author="Stoycho Rusinov" w:date="2026-08-08T15:23:00Z">
+      <w:del w:id="230" w:author="Stoycho Rusinov" w:date="2026-08-08T15:23:00Z">
         <w:r>
           <w:rPr>
             <w:rFonts w:ascii="Times New Roman" w:hAnsi="Times New Roman" w:cs="Times New Roman"/>
@@ -16499,7 +16477,7 @@
           <w:delText>applications.</w:delText>
         </w:r>
       </w:del>
-      <w:ins w:id="229" w:author="Stoycho Rusinov" w:date="2026-08-08T15:23:00Z">
+      <w:ins w:id="231" w:author="Stoycho Rusinov" w:date="2026-08-08T15:23:00Z">
         <w:r>
           <w:rPr>
             <w:rFonts w:ascii="Times New Roman" w:hAnsi="Times New Roman" w:cs="Times New Roman"/>
@@ -16528,7 +16506,7 @@
         </w:rPr>
         <w:t xml:space="preserve">Figure </w:t>
       </w:r>
-      <w:del w:id="230" w:author="Stoycho Rusinov" w:date="2026-08-08T15:23:00Z">
+      <w:del w:id="232" w:author="Stoycho Rusinov" w:date="2026-08-08T15:23:00Z">
         <w:r>
           <w:rPr>
             <w:rFonts w:ascii="Times New Roman" w:hAnsi="Times New Roman" w:cs="Times New Roman"/>
@@ -16536,7 +16514,7 @@
           <w:delText>7</w:delText>
         </w:r>
       </w:del>
-      <w:ins w:id="231" w:author="Stoycho Rusinov" w:date="2026-08-08T15:23:00Z">
+      <w:ins w:id="233" w:author="Stoycho Rusinov" w:date="2026-08-08T15:23:00Z">
         <w:r>
           <w:rPr>
             <w:rFonts w:ascii="Times New Roman" w:hAnsi="Times New Roman" w:cs="Times New Roman"/>
@@ -16588,7 +16566,7 @@
       <w:pPr>
         <w:spacing w:line="360" w:lineRule="auto"/>
         <w:rPr>
-          <w:ins w:id="232" w:author="Stoycho Rusinov" w:date="2026-08-08T15:23:00Z"/>
+          <w:ins w:id="234" w:author="Stoycho Rusinov" w:date="2026-08-08T15:23:00Z"/>
           <w:rFonts w:ascii="Times New Roman" w:hAnsi="Times New Roman" w:cs="Times New Roman"/>
         </w:rPr>
       </w:pPr>
@@ -16598,7 +16576,7 @@
         <w:spacing w:line="360" w:lineRule="auto"/>
         <w:ind w:firstLine="720"/>
         <w:rPr>
-          <w:ins w:id="233" w:author="Stoycho Rusinov" w:date="2026-08-08T15:23:00Z"/>
+          <w:ins w:id="235" w:author="Stoycho Rusinov" w:date="2026-08-08T15:23:00Z"/>
           <w:rFonts w:ascii="Times New Roman" w:hAnsi="Times New Roman" w:cs="Times New Roman"/>
         </w:rPr>
       </w:pPr>
@@ -16608,7 +16586,7 @@
         <w:spacing w:line="360" w:lineRule="auto"/>
         <w:ind w:firstLine="720"/>
         <w:rPr>
-          <w:ins w:id="234" w:author="Stoycho Rusinov" w:date="2026-08-08T15:23:00Z"/>
+          <w:ins w:id="236" w:author="Stoycho Rusinov" w:date="2026-08-08T15:23:00Z"/>
           <w:rFonts w:ascii="Times New Roman" w:hAnsi="Times New Roman" w:cs="Times New Roman"/>
         </w:rPr>
       </w:pPr>
@@ -16618,7 +16596,7 @@
         <w:spacing w:line="360" w:lineRule="auto"/>
         <w:ind w:firstLine="720"/>
         <w:rPr>
-          <w:ins w:id="235" w:author="Stoycho Rusinov" w:date="2026-08-08T15:23:00Z"/>
+          <w:ins w:id="237" w:author="Stoycho Rusinov" w:date="2026-08-08T15:23:00Z"/>
           <w:rFonts w:ascii="Times New Roman" w:hAnsi="Times New Roman" w:cs="Times New Roman"/>
         </w:rPr>
       </w:pPr>
@@ -16628,7 +16606,7 @@
         <w:spacing w:line="360" w:lineRule="auto"/>
         <w:ind w:firstLine="720"/>
         <w:rPr>
-          <w:ins w:id="236" w:author="Stoycho Rusinov" w:date="2026-08-08T15:23:00Z"/>
+          <w:ins w:id="238" w:author="Stoycho Rusinov" w:date="2026-08-08T15:23:00Z"/>
           <w:rFonts w:ascii="Times New Roman" w:hAnsi="Times New Roman" w:cs="Times New Roman"/>
         </w:rPr>
       </w:pPr>
@@ -16638,7 +16616,7 @@
         <w:spacing w:line="360" w:lineRule="auto"/>
         <w:ind w:firstLine="720"/>
         <w:rPr>
-          <w:ins w:id="237" w:author="Stoycho Rusinov" w:date="2026-08-08T15:23:00Z"/>
+          <w:ins w:id="239" w:author="Stoycho Rusinov" w:date="2026-08-08T15:23:00Z"/>
           <w:rFonts w:ascii="Times New Roman" w:hAnsi="Times New Roman" w:cs="Times New Roman"/>
         </w:rPr>
       </w:pPr>
@@ -16648,7 +16626,7 @@
         <w:spacing w:line="360" w:lineRule="auto"/>
         <w:ind w:firstLine="720"/>
         <w:rPr>
-          <w:ins w:id="238" w:author="Stoycho Rusinov" w:date="2026-08-08T15:23:00Z"/>
+          <w:ins w:id="240" w:author="Stoycho Rusinov" w:date="2026-08-08T15:23:00Z"/>
           <w:rFonts w:ascii="Times New Roman" w:hAnsi="Times New Roman" w:cs="Times New Roman"/>
         </w:rPr>
       </w:pPr>
@@ -16658,7 +16636,7 @@
         <w:spacing w:line="360" w:lineRule="auto"/>
         <w:ind w:firstLine="720"/>
         <w:rPr>
-          <w:ins w:id="239" w:author="Stoycho Rusinov" w:date="2026-08-08T15:23:00Z"/>
+          <w:ins w:id="241" w:author="Stoycho Rusinov" w:date="2026-08-08T15:23:00Z"/>
           <w:rFonts w:ascii="Times New Roman" w:hAnsi="Times New Roman" w:cs="Times New Roman"/>
         </w:rPr>
       </w:pPr>
@@ -16668,7 +16646,7 @@
         <w:spacing w:line="360" w:lineRule="auto"/>
         <w:ind w:firstLine="720"/>
         <w:rPr>
-          <w:ins w:id="240" w:author="Stoycho Rusinov" w:date="2026-08-08T15:23:00Z"/>
+          <w:ins w:id="242" w:author="Stoycho Rusinov" w:date="2026-08-08T15:23:00Z"/>
           <w:rFonts w:ascii="Times New Roman" w:hAnsi="Times New Roman" w:cs="Times New Roman"/>
         </w:rPr>
       </w:pPr>
@@ -16678,7 +16656,7 @@
         <w:spacing w:line="360" w:lineRule="auto"/>
         <w:ind w:firstLine="720"/>
         <w:rPr>
-          <w:ins w:id="241" w:author="Stoycho Rusinov" w:date="2026-08-08T15:23:00Z"/>
+          <w:ins w:id="243" w:author="Stoycho Rusinov" w:date="2026-08-08T15:23:00Z"/>
           <w:rFonts w:ascii="Times New Roman" w:hAnsi="Times New Roman" w:cs="Times New Roman"/>
         </w:rPr>
       </w:pPr>
@@ -16688,7 +16666,7 @@
         <w:spacing w:line="360" w:lineRule="auto"/>
         <w:ind w:firstLine="720"/>
         <w:rPr>
-          <w:ins w:id="242" w:author="Stoycho Rusinov" w:date="2026-08-08T15:23:00Z"/>
+          <w:ins w:id="244" w:author="Stoycho Rusinov" w:date="2026-08-08T15:23:00Z"/>
           <w:rFonts w:ascii="Times New Roman" w:hAnsi="Times New Roman" w:cs="Times New Roman"/>
         </w:rPr>
       </w:pPr>
@@ -16698,7 +16676,7 @@
         <w:spacing w:line="360" w:lineRule="auto"/>
         <w:ind w:firstLine="720"/>
         <w:rPr>
-          <w:ins w:id="243" w:author="Stoycho Rusinov" w:date="2026-08-08T15:23:00Z"/>
+          <w:ins w:id="245" w:author="Stoycho Rusinov" w:date="2026-08-08T15:23:00Z"/>
           <w:rFonts w:ascii="Times New Roman" w:hAnsi="Times New Roman" w:cs="Times New Roman"/>
         </w:rPr>
       </w:pPr>
@@ -16708,7 +16686,7 @@
         <w:spacing w:line="360" w:lineRule="auto"/>
         <w:ind w:firstLine="720"/>
         <w:rPr>
-          <w:ins w:id="244" w:author="Stoycho Rusinov" w:date="2026-08-08T15:23:00Z"/>
+          <w:ins w:id="246" w:author="Stoycho Rusinov" w:date="2026-08-08T15:23:00Z"/>
           <w:rFonts w:ascii="Times New Roman" w:hAnsi="Times New Roman" w:cs="Times New Roman"/>
         </w:rPr>
       </w:pPr>
@@ -16718,7 +16696,7 @@
         <w:spacing w:line="360" w:lineRule="auto"/>
         <w:ind w:firstLine="720"/>
         <w:rPr>
-          <w:ins w:id="245" w:author="Stoycho Rusinov" w:date="2026-08-08T15:23:00Z"/>
+          <w:ins w:id="247" w:author="Stoycho Rusinov" w:date="2026-08-08T15:23:00Z"/>
           <w:rFonts w:ascii="Times New Roman" w:hAnsi="Times New Roman" w:cs="Times New Roman"/>
         </w:rPr>
       </w:pPr>
@@ -16728,7 +16706,7 @@
         <w:spacing w:line="360" w:lineRule="auto"/>
         <w:ind w:firstLine="720"/>
         <w:rPr>
-          <w:ins w:id="246" w:author="Stoycho Rusinov" w:date="2026-08-08T15:23:00Z"/>
+          <w:ins w:id="248" w:author="Stoycho Rusinov" w:date="2026-08-08T15:23:00Z"/>
           <w:rFonts w:ascii="Times New Roman" w:hAnsi="Times New Roman" w:cs="Times New Roman"/>
         </w:rPr>
       </w:pPr>
@@ -16738,7 +16716,7 @@
         <w:spacing w:line="360" w:lineRule="auto"/>
         <w:ind w:firstLine="720"/>
         <w:rPr>
-          <w:ins w:id="247" w:author="Stoycho Rusinov" w:date="2026-08-08T15:23:00Z"/>
+          <w:ins w:id="249" w:author="Stoycho Rusinov" w:date="2026-08-08T15:23:00Z"/>
           <w:rFonts w:ascii="Times New Roman" w:hAnsi="Times New Roman" w:cs="Times New Roman"/>
         </w:rPr>
       </w:pPr>
@@ -16748,7 +16726,7 @@
         <w:spacing w:line="360" w:lineRule="auto"/>
         <w:ind w:firstLine="720"/>
         <w:rPr>
-          <w:ins w:id="248" w:author="Stoycho Rusinov" w:date="2026-08-08T15:23:00Z"/>
+          <w:ins w:id="250" w:author="Stoycho Rusinov" w:date="2026-08-08T15:23:00Z"/>
           <w:rFonts w:ascii="Times New Roman" w:hAnsi="Times New Roman" w:cs="Times New Roman"/>
         </w:rPr>
       </w:pPr>
@@ -16758,7 +16736,7 @@
         <w:spacing w:line="360" w:lineRule="auto"/>
         <w:ind w:firstLine="720"/>
         <w:rPr>
-          <w:ins w:id="249" w:author="Stoycho Rusinov" w:date="2026-08-08T15:23:00Z"/>
+          <w:ins w:id="251" w:author="Stoycho Rusinov" w:date="2026-08-08T15:23:00Z"/>
           <w:rFonts w:ascii="Times New Roman" w:hAnsi="Times New Roman" w:cs="Times New Roman"/>
         </w:rPr>
       </w:pPr>
@@ -16768,7 +16746,7 @@
         <w:spacing w:line="360" w:lineRule="auto"/>
         <w:ind w:firstLine="720"/>
         <w:rPr>
-          <w:ins w:id="250" w:author="Stoycho Rusinov" w:date="2026-08-08T15:23:00Z"/>
+          <w:ins w:id="252" w:author="Stoycho Rusinov" w:date="2026-08-08T15:23:00Z"/>
           <w:rFonts w:ascii="Times New Roman" w:hAnsi="Times New Roman" w:cs="Times New Roman"/>
         </w:rPr>
       </w:pPr>
@@ -16778,7 +16756,7 @@
         <w:spacing w:line="360" w:lineRule="auto"/>
         <w:ind w:firstLine="720"/>
         <w:rPr>
-          <w:ins w:id="251" w:author="Stoycho Rusinov" w:date="2026-08-08T15:23:00Z"/>
+          <w:ins w:id="253" w:author="Stoycho Rusinov" w:date="2026-08-08T15:23:00Z"/>
           <w:rFonts w:ascii="Times New Roman" w:hAnsi="Times New Roman" w:cs="Times New Roman"/>
         </w:rPr>
       </w:pPr>
@@ -16788,7 +16766,7 @@
         <w:spacing w:line="360" w:lineRule="auto"/>
         <w:ind w:firstLine="720"/>
         <w:rPr>
-          <w:ins w:id="252" w:author="Stoycho Rusinov" w:date="2026-08-08T15:23:00Z"/>
+          <w:ins w:id="254" w:author="Stoycho Rusinov" w:date="2026-08-08T15:23:00Z"/>
           <w:rFonts w:ascii="Times New Roman" w:hAnsi="Times New Roman" w:cs="Times New Roman"/>
         </w:rPr>
       </w:pPr>
@@ -16907,7 +16885,7 @@
         <w:rPr>
           <w:rFonts w:ascii="Times New Roman" w:hAnsi="Times New Roman" w:cs="Times New Roman"/>
         </w:rPr>
-        <w:pPrChange w:id="253" w:author="Stoycho Rusinov" w:date="2026-08-08T15:23:00Z">
+        <w:pPrChange w:id="255" w:author="Stoycho Rusinov" w:date="2026-08-08T15:23:00Z">
           <w:pPr>
             <w:spacing w:line="360" w:lineRule="auto"/>
             <w:ind w:firstLine="720"/>
@@ -16930,7 +16908,7 @@
         </w:rPr>
         <w:t xml:space="preserve">Figure </w:t>
       </w:r>
-      <w:del w:id="254" w:author="Stoycho Rusinov" w:date="2026-08-08T15:23:00Z">
+      <w:del w:id="256" w:author="Stoycho Rusinov" w:date="2026-08-08T15:23:00Z">
         <w:r>
           <w:rPr>
             <w:rFonts w:ascii="Times New Roman" w:hAnsi="Times New Roman" w:cs="Times New Roman"/>
@@ -16940,7 +16918,7 @@
           <w:delText>7</w:delText>
         </w:r>
       </w:del>
-      <w:ins w:id="255" w:author="Stoycho Rusinov" w:date="2026-08-08T15:23:00Z">
+      <w:ins w:id="257" w:author="Stoycho Rusinov" w:date="2026-08-08T15:23:00Z">
         <w:r>
           <w:rPr>
             <w:rFonts w:ascii="Times New Roman" w:hAnsi="Times New Roman" w:cs="Times New Roman"/>
@@ -16979,7 +16957,7 @@
         </w:rPr>
         <w:lastRenderedPageBreak/>
         <w:drawing>
-          <wp:inline distT="0" distB="0" distL="0" distR="0">
+          <wp:inline distT="0" distB="0" distL="0" distR="0" wp14:anchorId="5E4BD20D" wp14:editId="1DC61464">
             <wp:extent cx="5727700" cy="4091214"/>
             <wp:effectExtent l="0" t="0" r="0" b="0"/>
             <wp:docPr id="40" name="Picture"/>
@@ -18176,34 +18154,12 @@
         </w:rPr>
         <w:t xml:space="preserve">. The results are presented in Figures </w:t>
       </w:r>
-      <w:del w:id="256" w:author="Stoycho Rusinov" w:date="2026-08-08T15:23:00Z">
-        <w:r>
-          <w:rPr>
-            <w:rFonts w:ascii="Times New Roman" w:hAnsi="Times New Roman" w:cs="Times New Roman"/>
-          </w:rPr>
-          <w:delText>8</w:delText>
-        </w:r>
-      </w:del>
-      <w:ins w:id="257" w:author="Stoycho Rusinov" w:date="2026-08-08T15:23:00Z">
-        <w:r>
-          <w:rPr>
-            <w:rFonts w:ascii="Times New Roman" w:hAnsi="Times New Roman" w:cs="Times New Roman"/>
-          </w:rPr>
-          <w:t>7</w:t>
-        </w:r>
-      </w:ins>
-      <w:r>
-        <w:rPr>
-          <w:rFonts w:ascii="Times New Roman" w:hAnsi="Times New Roman" w:cs="Times New Roman"/>
-        </w:rPr>
-        <w:t xml:space="preserve"> and </w:t>
-      </w:r>
       <w:del w:id="258" w:author="Stoycho Rusinov" w:date="2026-08-08T15:23:00Z">
         <w:r>
           <w:rPr>
             <w:rFonts w:ascii="Times New Roman" w:hAnsi="Times New Roman" w:cs="Times New Roman"/>
           </w:rPr>
-          <w:delText>9</w:delText>
+          <w:delText>8</w:delText>
         </w:r>
       </w:del>
       <w:ins w:id="259" w:author="Stoycho Rusinov" w:date="2026-08-08T15:23:00Z">
@@ -18211,53 +18167,75 @@
           <w:rPr>
             <w:rFonts w:ascii="Times New Roman" w:hAnsi="Times New Roman" w:cs="Times New Roman"/>
           </w:rPr>
-          <w:t>8</w:t>
+          <w:t>7</w:t>
         </w:r>
       </w:ins>
       <w:r>
         <w:rPr>
           <w:rFonts w:ascii="Times New Roman" w:hAnsi="Times New Roman" w:cs="Times New Roman"/>
         </w:rPr>
-        <w:t xml:space="preserve"> for the ATT and the country-specific responses, respectively.</w:t>
-      </w:r>
-    </w:p>
-    <w:p>
-      <w:pPr>
-        <w:spacing w:line="360" w:lineRule="auto"/>
-        <w:rPr>
-          <w:rFonts w:ascii="Times New Roman" w:hAnsi="Times New Roman" w:cs="Times New Roman"/>
-        </w:rPr>
-      </w:pPr>
-    </w:p>
-    <w:p>
-      <w:pPr>
-        <w:spacing w:line="360" w:lineRule="auto"/>
-        <w:rPr>
-          <w:rFonts w:ascii="Times New Roman" w:hAnsi="Times New Roman" w:cs="Times New Roman"/>
-        </w:rPr>
-      </w:pPr>
-      <w:r>
-        <w:rPr>
-          <w:rFonts w:ascii="Times New Roman" w:hAnsi="Times New Roman" w:cs="Times New Roman"/>
-          <w:b/>
-          <w:bCs/>
-        </w:rPr>
-        <w:t xml:space="preserve">Figure </w:t>
+        <w:t xml:space="preserve"> and </w:t>
       </w:r>
       <w:del w:id="260" w:author="Stoycho Rusinov" w:date="2026-08-08T15:23:00Z">
         <w:r>
           <w:rPr>
             <w:rFonts w:ascii="Times New Roman" w:hAnsi="Times New Roman" w:cs="Times New Roman"/>
-            <w:b/>
-            <w:bCs/>
-          </w:rPr>
-          <w:delText>8</w:delText>
+          </w:rPr>
+          <w:delText>9</w:delText>
         </w:r>
       </w:del>
       <w:ins w:id="261" w:author="Stoycho Rusinov" w:date="2026-08-08T15:23:00Z">
         <w:r>
           <w:rPr>
             <w:rFonts w:ascii="Times New Roman" w:hAnsi="Times New Roman" w:cs="Times New Roman"/>
+          </w:rPr>
+          <w:t>8</w:t>
+        </w:r>
+      </w:ins>
+      <w:r>
+        <w:rPr>
+          <w:rFonts w:ascii="Times New Roman" w:hAnsi="Times New Roman" w:cs="Times New Roman"/>
+        </w:rPr>
+        <w:t xml:space="preserve"> for the ATT and the country-specific responses, respectively.</w:t>
+      </w:r>
+    </w:p>
+    <w:p>
+      <w:pPr>
+        <w:spacing w:line="360" w:lineRule="auto"/>
+        <w:rPr>
+          <w:rFonts w:ascii="Times New Roman" w:hAnsi="Times New Roman" w:cs="Times New Roman"/>
+        </w:rPr>
+      </w:pPr>
+    </w:p>
+    <w:p>
+      <w:pPr>
+        <w:spacing w:line="360" w:lineRule="auto"/>
+        <w:rPr>
+          <w:rFonts w:ascii="Times New Roman" w:hAnsi="Times New Roman" w:cs="Times New Roman"/>
+        </w:rPr>
+      </w:pPr>
+      <w:r>
+        <w:rPr>
+          <w:rFonts w:ascii="Times New Roman" w:hAnsi="Times New Roman" w:cs="Times New Roman"/>
+          <w:b/>
+          <w:bCs/>
+        </w:rPr>
+        <w:t xml:space="preserve">Figure </w:t>
+      </w:r>
+      <w:del w:id="262" w:author="Stoycho Rusinov" w:date="2026-08-08T15:23:00Z">
+        <w:r>
+          <w:rPr>
+            <w:rFonts w:ascii="Times New Roman" w:hAnsi="Times New Roman" w:cs="Times New Roman"/>
+            <w:b/>
+            <w:bCs/>
+          </w:rPr>
+          <w:delText>8</w:delText>
+        </w:r>
+      </w:del>
+      <w:ins w:id="263" w:author="Stoycho Rusinov" w:date="2026-08-08T15:23:00Z">
+        <w:r>
+          <w:rPr>
+            <w:rFonts w:ascii="Times New Roman" w:hAnsi="Times New Roman" w:cs="Times New Roman"/>
             <w:b/>
             <w:bCs/>
           </w:rPr>
@@ -18292,7 +18270,7 @@
           <w:noProof/>
         </w:rPr>
         <w:drawing>
-          <wp:inline distT="0" distB="0" distL="0" distR="0">
+          <wp:inline distT="0" distB="0" distL="0" distR="0" wp14:anchorId="530907BC" wp14:editId="1C7A951C">
             <wp:extent cx="5727700" cy="4091214"/>
             <wp:effectExtent l="0" t="0" r="0" b="0"/>
             <wp:docPr id="43" name="Picture"/>
@@ -18411,7 +18389,7 @@
         </w:rPr>
         <w:t xml:space="preserve">Figure </w:t>
       </w:r>
-      <w:del w:id="262" w:author="Stoycho Rusinov" w:date="2026-08-08T15:23:00Z">
+      <w:del w:id="264" w:author="Stoycho Rusinov" w:date="2026-08-08T15:23:00Z">
         <w:r>
           <w:rPr>
             <w:rFonts w:ascii="Times New Roman" w:hAnsi="Times New Roman" w:cs="Times New Roman"/>
@@ -18421,7 +18399,7 @@
           <w:delText>9</w:delText>
         </w:r>
       </w:del>
-      <w:ins w:id="263" w:author="Stoycho Rusinov" w:date="2026-08-08T15:23:00Z">
+      <w:ins w:id="265" w:author="Stoycho Rusinov" w:date="2026-08-08T15:23:00Z">
         <w:r>
           <w:rPr>
             <w:rFonts w:ascii="Times New Roman" w:hAnsi="Times New Roman" w:cs="Times New Roman"/>
@@ -18459,7 +18437,7 @@
           <w:noProof/>
         </w:rPr>
         <w:drawing>
-          <wp:inline distT="0" distB="0" distL="0" distR="0">
+          <wp:inline distT="0" distB="0" distL="0" distR="0" wp14:anchorId="25B71689" wp14:editId="7BE8448E">
             <wp:extent cx="5727700" cy="4091214"/>
             <wp:effectExtent l="0" t="0" r="0" b="0"/>
             <wp:docPr id="46" name="Picture"/>
@@ -18536,34 +18514,12 @@
         </w:rPr>
         <w:t xml:space="preserve">Figures </w:t>
       </w:r>
-      <w:del w:id="264" w:author="Stoycho Rusinov" w:date="2026-08-08T15:23:00Z">
-        <w:r>
-          <w:rPr>
-            <w:rFonts w:ascii="Times New Roman" w:hAnsi="Times New Roman" w:cs="Times New Roman"/>
-          </w:rPr>
-          <w:delText>8</w:delText>
-        </w:r>
-      </w:del>
-      <w:ins w:id="265" w:author="Stoycho Rusinov" w:date="2026-08-08T15:23:00Z">
-        <w:r>
-          <w:rPr>
-            <w:rFonts w:ascii="Times New Roman" w:hAnsi="Times New Roman" w:cs="Times New Roman"/>
-          </w:rPr>
-          <w:t>7</w:t>
-        </w:r>
-      </w:ins>
-      <w:r>
-        <w:rPr>
-          <w:rFonts w:ascii="Times New Roman" w:hAnsi="Times New Roman" w:cs="Times New Roman"/>
-        </w:rPr>
-        <w:t xml:space="preserve"> and </w:t>
-      </w:r>
       <w:del w:id="266" w:author="Stoycho Rusinov" w:date="2026-08-08T15:23:00Z">
         <w:r>
           <w:rPr>
             <w:rFonts w:ascii="Times New Roman" w:hAnsi="Times New Roman" w:cs="Times New Roman"/>
           </w:rPr>
-          <w:delText>9</w:delText>
+          <w:delText>8</w:delText>
         </w:r>
       </w:del>
       <w:ins w:id="267" w:author="Stoycho Rusinov" w:date="2026-08-08T15:23:00Z">
@@ -18571,44 +18527,21 @@
           <w:rPr>
             <w:rFonts w:ascii="Times New Roman" w:hAnsi="Times New Roman" w:cs="Times New Roman"/>
           </w:rPr>
-          <w:t>8</w:t>
+          <w:t>7</w:t>
         </w:r>
       </w:ins>
       <w:r>
         <w:rPr>
           <w:rFonts w:ascii="Times New Roman" w:hAnsi="Times New Roman" w:cs="Times New Roman"/>
         </w:rPr>
-        <w:t xml:space="preserve"> show the estimated effect is not an artifact of a particular donor pool. Across all alternatives the EU × Post coefficient stays large, negative, and far from zero. Whether the control group is the baseline synthetic pool, OECD, high-income, low-income, or Ireland alone, the estimated collapse is of similar order. Point estimates move because each pool implies a different benchmark, but none changes the substantive conclusion.</w:t>
-      </w:r>
-    </w:p>
-    <w:p>
-      <w:pPr>
-        <w:spacing w:line="360" w:lineRule="auto"/>
-        <w:rPr>
-          <w:rFonts w:ascii="Times New Roman" w:hAnsi="Times New Roman" w:cs="Times New Roman"/>
-        </w:rPr>
-      </w:pPr>
-    </w:p>
-    <w:p>
-      <w:pPr>
-        <w:spacing w:line="360" w:lineRule="auto"/>
-        <w:ind w:firstLine="240"/>
-        <w:rPr>
-          <w:rFonts w:ascii="Times New Roman" w:hAnsi="Times New Roman" w:cs="Times New Roman"/>
-        </w:rPr>
-      </w:pPr>
-      <w:r>
-        <w:rPr>
-          <w:rFonts w:ascii="Times New Roman" w:hAnsi="Times New Roman" w:cs="Times New Roman"/>
-        </w:rPr>
-        <w:t xml:space="preserve">The poor-country control group generates the most negative estimates. This is informative because it shows that the decline is not a generic post-pandemic fall in </w:t>
+        <w:t xml:space="preserve"> and </w:t>
       </w:r>
       <w:del w:id="268" w:author="Stoycho Rusinov" w:date="2026-08-08T15:23:00Z">
         <w:r>
           <w:rPr>
             <w:rFonts w:ascii="Times New Roman" w:hAnsi="Times New Roman" w:cs="Times New Roman"/>
           </w:rPr>
-          <w:delText>applications</w:delText>
+          <w:delText>9</w:delText>
         </w:r>
       </w:del>
       <w:ins w:id="269" w:author="Stoycho Rusinov" w:date="2026-08-08T15:23:00Z">
@@ -18616,28 +18549,44 @@
           <w:rPr>
             <w:rFonts w:ascii="Times New Roman" w:hAnsi="Times New Roman" w:cs="Times New Roman"/>
           </w:rPr>
-          <w:t>applicant numbers</w:t>
+          <w:t>8</w:t>
         </w:r>
       </w:ins>
       <w:r>
         <w:rPr>
           <w:rFonts w:ascii="Times New Roman" w:hAnsi="Times New Roman" w:cs="Times New Roman"/>
         </w:rPr>
-        <w:t xml:space="preserve"> from low-income origins. If that were the mechanism, low-income non-EU countries should absorb much of the EU decline and push the coefficient toward zero. The Irish case also survives as a robustness check against the Graduate route visa in 2021. Thereby demonstrating that if the result were driven by common shocks to nearby or culturally connected markets or the Graduate route visa, the comparison with Ireland should </w:t>
-      </w:r>
-      <w:r>
-        <w:rPr>
-          <w:rFonts w:ascii="Times New Roman" w:hAnsi="Times New Roman" w:cs="Times New Roman"/>
-        </w:rPr>
-        <w:lastRenderedPageBreak/>
-        <w:t xml:space="preserve">substantially weaken the estimate. It does not. The estimate remains close to the other robustness results, reinforcing the interpretation that the post-2021 break reflects the EU-specific loss of Home Fee status and loan access. Figure </w:t>
+        <w:t xml:space="preserve"> show the estimated effect is not an artifact of a particular donor pool. Across all alternatives the EU × Post coefficient stays large, negative, and far from zero. Whether the control group is the baseline synthetic pool, OECD, high-income, low-income, or Ireland alone, the estimated collapse is of similar order. Point estimates move because each pool implies a different benchmark, but none changes the substantive conclusion.</w:t>
+      </w:r>
+    </w:p>
+    <w:p>
+      <w:pPr>
+        <w:spacing w:line="360" w:lineRule="auto"/>
+        <w:rPr>
+          <w:rFonts w:ascii="Times New Roman" w:hAnsi="Times New Roman" w:cs="Times New Roman"/>
+        </w:rPr>
+      </w:pPr>
+    </w:p>
+    <w:p>
+      <w:pPr>
+        <w:spacing w:line="360" w:lineRule="auto"/>
+        <w:ind w:firstLine="240"/>
+        <w:rPr>
+          <w:rFonts w:ascii="Times New Roman" w:hAnsi="Times New Roman" w:cs="Times New Roman"/>
+        </w:rPr>
+      </w:pPr>
+      <w:r>
+        <w:rPr>
+          <w:rFonts w:ascii="Times New Roman" w:hAnsi="Times New Roman" w:cs="Times New Roman"/>
+        </w:rPr>
+        <w:t xml:space="preserve">The poor-country control group generates the most negative estimates. This is informative because it shows that the decline is not a generic post-pandemic fall in </w:t>
       </w:r>
       <w:del w:id="270" w:author="Stoycho Rusinov" w:date="2026-08-08T15:23:00Z">
         <w:r>
           <w:rPr>
             <w:rFonts w:ascii="Times New Roman" w:hAnsi="Times New Roman" w:cs="Times New Roman"/>
           </w:rPr>
-          <w:delText>9</w:delText>
+          <w:delText>applications</w:delText>
         </w:r>
       </w:del>
       <w:ins w:id="271" w:author="Stoycho Rusinov" w:date="2026-08-08T15:23:00Z">
@@ -18645,6 +18594,35 @@
           <w:rPr>
             <w:rFonts w:ascii="Times New Roman" w:hAnsi="Times New Roman" w:cs="Times New Roman"/>
           </w:rPr>
+          <w:t>applicant numbers</w:t>
+        </w:r>
+      </w:ins>
+      <w:r>
+        <w:rPr>
+          <w:rFonts w:ascii="Times New Roman" w:hAnsi="Times New Roman" w:cs="Times New Roman"/>
+        </w:rPr>
+        <w:t xml:space="preserve"> from low-income origins. If that were the mechanism, low-income non-EU countries should absorb much of the EU decline and push the coefficient toward zero. The Irish case also survives as a robustness check against the Graduate route visa in 2021. Thereby demonstrating that if the result were driven by common shocks to nearby or culturally connected markets or the Graduate route visa, the comparison with Ireland should </w:t>
+      </w:r>
+      <w:r>
+        <w:rPr>
+          <w:rFonts w:ascii="Times New Roman" w:hAnsi="Times New Roman" w:cs="Times New Roman"/>
+        </w:rPr>
+        <w:lastRenderedPageBreak/>
+        <w:t xml:space="preserve">substantially weaken the estimate. It does not. The estimate remains close to the other robustness results, reinforcing the interpretation that the post-2021 break reflects the EU-specific loss of Home Fee status and loan access. Figure </w:t>
+      </w:r>
+      <w:del w:id="272" w:author="Stoycho Rusinov" w:date="2026-08-08T15:23:00Z">
+        <w:r>
+          <w:rPr>
+            <w:rFonts w:ascii="Times New Roman" w:hAnsi="Times New Roman" w:cs="Times New Roman"/>
+          </w:rPr>
+          <w:delText>9</w:delText>
+        </w:r>
+      </w:del>
+      <w:ins w:id="273" w:author="Stoycho Rusinov" w:date="2026-08-08T15:23:00Z">
+        <w:r>
+          <w:rPr>
+            <w:rFonts w:ascii="Times New Roman" w:hAnsi="Times New Roman" w:cs="Times New Roman"/>
+          </w:rPr>
           <w:t>8</w:t>
         </w:r>
       </w:ins>
@@ -18654,7 +18632,7 @@
         </w:rPr>
         <w:t xml:space="preserve"> also strengthens the robustness of the main results by showing that the ranking of the post-Brexit responses is preserved regardless of the chosen baseline. Another important point is that the weighting of the control group appears to affect the final estimates only at the margin, providing robust evidence that both the order and the magnitude of the collapse were stable enough for the inferences made in this paper. As a further check that does not rely on the constrained donor weights, we estimate the average treatment effect on the full donor pool with the standalone synthetic difference-in-differences estimator of Arkhangelsky et al. (2021). The estimator returns an ATT of -1.23 (jackknife standard error 0.10, with a 95% confidence interval from -1.43 to -1.02), which falls squarely within the range of the pooled and saturated estimates reported above and confirms that the headline collapse in EU </w:t>
       </w:r>
-      <w:del w:id="272" w:author="Stoycho Rusinov" w:date="2026-08-08T15:23:00Z">
+      <w:del w:id="274" w:author="Stoycho Rusinov" w:date="2026-08-08T15:23:00Z">
         <w:r>
           <w:rPr>
             <w:rFonts w:ascii="Times New Roman" w:hAnsi="Times New Roman" w:cs="Times New Roman"/>
@@ -18662,7 +18640,7 @@
           <w:delText>applications</w:delText>
         </w:r>
       </w:del>
-      <w:ins w:id="273" w:author="Stoycho Rusinov" w:date="2026-08-08T15:23:00Z">
+      <w:ins w:id="275" w:author="Stoycho Rusinov" w:date="2026-08-08T15:23:00Z">
         <w:r>
           <w:rPr>
             <w:rFonts w:ascii="Times New Roman" w:hAnsi="Times New Roman" w:cs="Times New Roman"/>
@@ -19758,194 +19736,10 @@
         </w:rPr>
         <w:t xml:space="preserve">A further peer-review concern is the sensitivity of the present value to calibration. We recompute the present values and re-estimate the correlations across loan-correction settings (Figure </w:t>
       </w:r>
-      <w:del w:id="274" w:author="Stoycho Rusinov" w:date="2026-08-08T15:23:00Z">
-        <w:r>
-          <w:rPr>
-            <w:rFonts w:ascii="Times New Roman" w:hAnsi="Times New Roman" w:cs="Times New Roman"/>
-          </w:rPr>
-          <w:delText>10</w:delText>
-        </w:r>
-      </w:del>
-      <w:ins w:id="275" w:author="Stoycho Rusinov" w:date="2026-08-08T15:23:00Z">
-        <w:r>
-          <w:rPr>
-            <w:rFonts w:ascii="Times New Roman" w:hAnsi="Times New Roman" w:cs="Times New Roman"/>
-          </w:rPr>
-          <w:t>9</w:t>
-        </w:r>
-      </w:ins>
-      <w:r>
-        <w:rPr>
-          <w:rFonts w:ascii="Times New Roman" w:hAnsi="Times New Roman" w:cs="Times New Roman"/>
-        </w:rPr>
-        <w:t>). Across the discount-rate sweep the loan-adjusted gradient stays insignificant throughout, its p-value above 5% at every calibration. The wage-growth sweep is more nuanced: the gradient is significant only at the two lowest calibrations, g = 0 (p ≈ 0.04) and g = 0.5% (p ≈ 0.05), and insignificant from g = 1% on. The underlying slope runs from about −0.722 at g = 0% to about 0.291 at 4%, reversing sign, while standard errors barely move. The disappearance of the gradient therefore holds across the discount-rate sweep and the baseline and most plausible positive wage-growth calibrations, though not the entire parameter space.</w:t>
-      </w:r>
-    </w:p>
-    <w:p>
-      <w:pPr>
-        <w:spacing w:line="360" w:lineRule="auto"/>
-        <w:ind w:firstLine="720"/>
-        <w:rPr>
-          <w:rFonts w:ascii="Times New Roman" w:hAnsi="Times New Roman" w:cs="Times New Roman"/>
-        </w:rPr>
-      </w:pPr>
-    </w:p>
-    <w:p>
-      <w:pPr>
-        <w:spacing w:line="360" w:lineRule="auto"/>
-        <w:ind w:firstLine="720"/>
-        <w:rPr>
-          <w:rFonts w:ascii="Times New Roman" w:hAnsi="Times New Roman" w:cs="Times New Roman"/>
-        </w:rPr>
-      </w:pPr>
-    </w:p>
-    <w:p>
-      <w:pPr>
-        <w:spacing w:line="360" w:lineRule="auto"/>
-        <w:ind w:firstLine="720"/>
-        <w:rPr>
-          <w:rFonts w:ascii="Times New Roman" w:hAnsi="Times New Roman" w:cs="Times New Roman"/>
-        </w:rPr>
-      </w:pPr>
-    </w:p>
-    <w:p>
-      <w:pPr>
-        <w:spacing w:line="360" w:lineRule="auto"/>
-        <w:ind w:firstLine="720"/>
-        <w:rPr>
-          <w:rFonts w:ascii="Times New Roman" w:hAnsi="Times New Roman" w:cs="Times New Roman"/>
-        </w:rPr>
-      </w:pPr>
-    </w:p>
-    <w:p>
-      <w:pPr>
-        <w:spacing w:line="360" w:lineRule="auto"/>
-        <w:ind w:firstLine="720"/>
-        <w:rPr>
-          <w:rFonts w:ascii="Times New Roman" w:hAnsi="Times New Roman" w:cs="Times New Roman"/>
-        </w:rPr>
-      </w:pPr>
-    </w:p>
-    <w:p>
-      <w:pPr>
-        <w:spacing w:line="360" w:lineRule="auto"/>
-        <w:ind w:firstLine="720"/>
-        <w:rPr>
-          <w:rFonts w:ascii="Times New Roman" w:hAnsi="Times New Roman" w:cs="Times New Roman"/>
-        </w:rPr>
-      </w:pPr>
-    </w:p>
-    <w:p>
-      <w:pPr>
-        <w:spacing w:line="360" w:lineRule="auto"/>
-        <w:ind w:firstLine="720"/>
-        <w:rPr>
-          <w:rFonts w:ascii="Times New Roman" w:hAnsi="Times New Roman" w:cs="Times New Roman"/>
-        </w:rPr>
-      </w:pPr>
-    </w:p>
-    <w:p>
-      <w:pPr>
-        <w:spacing w:line="360" w:lineRule="auto"/>
-        <w:ind w:firstLine="720"/>
-        <w:rPr>
-          <w:rFonts w:ascii="Times New Roman" w:hAnsi="Times New Roman" w:cs="Times New Roman"/>
-        </w:rPr>
-      </w:pPr>
-    </w:p>
-    <w:p>
-      <w:pPr>
-        <w:spacing w:line="360" w:lineRule="auto"/>
-        <w:ind w:firstLine="720"/>
-        <w:rPr>
-          <w:rFonts w:ascii="Times New Roman" w:hAnsi="Times New Roman" w:cs="Times New Roman"/>
-        </w:rPr>
-      </w:pPr>
-    </w:p>
-    <w:p>
-      <w:pPr>
-        <w:spacing w:line="360" w:lineRule="auto"/>
-        <w:ind w:firstLine="720"/>
-        <w:rPr>
-          <w:rFonts w:ascii="Times New Roman" w:hAnsi="Times New Roman" w:cs="Times New Roman"/>
-        </w:rPr>
-      </w:pPr>
-    </w:p>
-    <w:p>
-      <w:pPr>
-        <w:spacing w:line="360" w:lineRule="auto"/>
-        <w:ind w:firstLine="720"/>
-        <w:rPr>
-          <w:rFonts w:ascii="Times New Roman" w:hAnsi="Times New Roman" w:cs="Times New Roman"/>
-        </w:rPr>
-      </w:pPr>
-    </w:p>
-    <w:p>
-      <w:pPr>
-        <w:spacing w:line="360" w:lineRule="auto"/>
-        <w:ind w:firstLine="720"/>
-        <w:rPr>
-          <w:rFonts w:ascii="Times New Roman" w:hAnsi="Times New Roman" w:cs="Times New Roman"/>
-        </w:rPr>
-      </w:pPr>
-    </w:p>
-    <w:p>
-      <w:pPr>
-        <w:spacing w:line="360" w:lineRule="auto"/>
-        <w:ind w:firstLine="720"/>
-        <w:rPr>
-          <w:rFonts w:ascii="Times New Roman" w:hAnsi="Times New Roman" w:cs="Times New Roman"/>
-        </w:rPr>
-      </w:pPr>
-    </w:p>
-    <w:p>
-      <w:pPr>
-        <w:spacing w:line="360" w:lineRule="auto"/>
-        <w:ind w:firstLine="720"/>
-        <w:rPr>
-          <w:rFonts w:ascii="Times New Roman" w:hAnsi="Times New Roman" w:cs="Times New Roman"/>
-        </w:rPr>
-      </w:pPr>
-    </w:p>
-    <w:p>
-      <w:pPr>
-        <w:spacing w:line="360" w:lineRule="auto"/>
-        <w:ind w:firstLine="720"/>
-        <w:rPr>
-          <w:rFonts w:ascii="Times New Roman" w:hAnsi="Times New Roman" w:cs="Times New Roman"/>
-        </w:rPr>
-      </w:pPr>
-    </w:p>
-    <w:p>
-      <w:pPr>
-        <w:spacing w:line="360" w:lineRule="auto"/>
-        <w:rPr>
-          <w:rFonts w:ascii="Times New Roman" w:hAnsi="Times New Roman" w:cs="Times New Roman"/>
-        </w:rPr>
-      </w:pPr>
-    </w:p>
-    <w:p>
-      <w:pPr>
-        <w:spacing w:line="360" w:lineRule="auto"/>
-        <w:rPr>
-          <w:rFonts w:ascii="Times New Roman" w:hAnsi="Times New Roman" w:cs="Times New Roman"/>
-        </w:rPr>
-      </w:pPr>
-      <w:r>
-        <w:rPr>
-          <w:rFonts w:ascii="Times New Roman" w:hAnsi="Times New Roman" w:cs="Times New Roman"/>
-          <w:b/>
-          <w:bCs/>
-        </w:rPr>
-        <w:lastRenderedPageBreak/>
-        <w:t xml:space="preserve">Figure </w:t>
-      </w:r>
       <w:del w:id="276" w:author="Stoycho Rusinov" w:date="2026-08-08T15:23:00Z">
         <w:r>
           <w:rPr>
             <w:rFonts w:ascii="Times New Roman" w:hAnsi="Times New Roman" w:cs="Times New Roman"/>
-            <w:b/>
-            <w:bCs/>
           </w:rPr>
           <w:delText>10</w:delText>
         </w:r>
@@ -19954,8 +19748,6 @@
         <w:r>
           <w:rPr>
             <w:rFonts w:ascii="Times New Roman" w:hAnsi="Times New Roman" w:cs="Times New Roman"/>
-            <w:b/>
-            <w:bCs/>
           </w:rPr>
           <w:t>9</w:t>
         </w:r>
@@ -19963,9 +19755,195 @@
       <w:r>
         <w:rPr>
           <w:rFonts w:ascii="Times New Roman" w:hAnsi="Times New Roman" w:cs="Times New Roman"/>
+        </w:rPr>
+        <w:t>). Across the discount-rate sweep the loan-adjusted gradient stays insignificant throughout, its p-value above 5% at every calibration. The wage-growth sweep is more nuanced: the gradient is significant only at the two lowest calibrations, g = 0 (p ≈ 0.04) and g = 0.5% (p ≈ 0.05), and insignificant from g = 1% on. The underlying slope runs from about −0.722 at g = 0% to about 0.291 at 4%, reversing sign, while standard errors barely move. The disappearance of the gradient therefore holds across the discount-rate sweep and the baseline and most plausible positive wage-growth calibrations, though not the entire parameter space.</w:t>
+      </w:r>
+    </w:p>
+    <w:p>
+      <w:pPr>
+        <w:spacing w:line="360" w:lineRule="auto"/>
+        <w:ind w:firstLine="720"/>
+        <w:rPr>
+          <w:rFonts w:ascii="Times New Roman" w:hAnsi="Times New Roman" w:cs="Times New Roman"/>
+        </w:rPr>
+      </w:pPr>
+    </w:p>
+    <w:p>
+      <w:pPr>
+        <w:spacing w:line="360" w:lineRule="auto"/>
+        <w:ind w:firstLine="720"/>
+        <w:rPr>
+          <w:rFonts w:ascii="Times New Roman" w:hAnsi="Times New Roman" w:cs="Times New Roman"/>
+        </w:rPr>
+      </w:pPr>
+    </w:p>
+    <w:p>
+      <w:pPr>
+        <w:spacing w:line="360" w:lineRule="auto"/>
+        <w:ind w:firstLine="720"/>
+        <w:rPr>
+          <w:rFonts w:ascii="Times New Roman" w:hAnsi="Times New Roman" w:cs="Times New Roman"/>
+        </w:rPr>
+      </w:pPr>
+    </w:p>
+    <w:p>
+      <w:pPr>
+        <w:spacing w:line="360" w:lineRule="auto"/>
+        <w:ind w:firstLine="720"/>
+        <w:rPr>
+          <w:rFonts w:ascii="Times New Roman" w:hAnsi="Times New Roman" w:cs="Times New Roman"/>
+        </w:rPr>
+      </w:pPr>
+    </w:p>
+    <w:p>
+      <w:pPr>
+        <w:spacing w:line="360" w:lineRule="auto"/>
+        <w:ind w:firstLine="720"/>
+        <w:rPr>
+          <w:rFonts w:ascii="Times New Roman" w:hAnsi="Times New Roman" w:cs="Times New Roman"/>
+        </w:rPr>
+      </w:pPr>
+    </w:p>
+    <w:p>
+      <w:pPr>
+        <w:spacing w:line="360" w:lineRule="auto"/>
+        <w:ind w:firstLine="720"/>
+        <w:rPr>
+          <w:rFonts w:ascii="Times New Roman" w:hAnsi="Times New Roman" w:cs="Times New Roman"/>
+        </w:rPr>
+      </w:pPr>
+    </w:p>
+    <w:p>
+      <w:pPr>
+        <w:spacing w:line="360" w:lineRule="auto"/>
+        <w:ind w:firstLine="720"/>
+        <w:rPr>
+          <w:rFonts w:ascii="Times New Roman" w:hAnsi="Times New Roman" w:cs="Times New Roman"/>
+        </w:rPr>
+      </w:pPr>
+    </w:p>
+    <w:p>
+      <w:pPr>
+        <w:spacing w:line="360" w:lineRule="auto"/>
+        <w:ind w:firstLine="720"/>
+        <w:rPr>
+          <w:rFonts w:ascii="Times New Roman" w:hAnsi="Times New Roman" w:cs="Times New Roman"/>
+        </w:rPr>
+      </w:pPr>
+    </w:p>
+    <w:p>
+      <w:pPr>
+        <w:spacing w:line="360" w:lineRule="auto"/>
+        <w:ind w:firstLine="720"/>
+        <w:rPr>
+          <w:rFonts w:ascii="Times New Roman" w:hAnsi="Times New Roman" w:cs="Times New Roman"/>
+        </w:rPr>
+      </w:pPr>
+    </w:p>
+    <w:p>
+      <w:pPr>
+        <w:spacing w:line="360" w:lineRule="auto"/>
+        <w:ind w:firstLine="720"/>
+        <w:rPr>
+          <w:rFonts w:ascii="Times New Roman" w:hAnsi="Times New Roman" w:cs="Times New Roman"/>
+        </w:rPr>
+      </w:pPr>
+    </w:p>
+    <w:p>
+      <w:pPr>
+        <w:spacing w:line="360" w:lineRule="auto"/>
+        <w:ind w:firstLine="720"/>
+        <w:rPr>
+          <w:rFonts w:ascii="Times New Roman" w:hAnsi="Times New Roman" w:cs="Times New Roman"/>
+        </w:rPr>
+      </w:pPr>
+    </w:p>
+    <w:p>
+      <w:pPr>
+        <w:spacing w:line="360" w:lineRule="auto"/>
+        <w:ind w:firstLine="720"/>
+        <w:rPr>
+          <w:rFonts w:ascii="Times New Roman" w:hAnsi="Times New Roman" w:cs="Times New Roman"/>
+        </w:rPr>
+      </w:pPr>
+    </w:p>
+    <w:p>
+      <w:pPr>
+        <w:spacing w:line="360" w:lineRule="auto"/>
+        <w:ind w:firstLine="720"/>
+        <w:rPr>
+          <w:rFonts w:ascii="Times New Roman" w:hAnsi="Times New Roman" w:cs="Times New Roman"/>
+        </w:rPr>
+      </w:pPr>
+    </w:p>
+    <w:p>
+      <w:pPr>
+        <w:spacing w:line="360" w:lineRule="auto"/>
+        <w:ind w:firstLine="720"/>
+        <w:rPr>
+          <w:rFonts w:ascii="Times New Roman" w:hAnsi="Times New Roman" w:cs="Times New Roman"/>
+        </w:rPr>
+      </w:pPr>
+    </w:p>
+    <w:p>
+      <w:pPr>
+        <w:spacing w:line="360" w:lineRule="auto"/>
+        <w:ind w:firstLine="720"/>
+        <w:rPr>
+          <w:rFonts w:ascii="Times New Roman" w:hAnsi="Times New Roman" w:cs="Times New Roman"/>
+        </w:rPr>
+      </w:pPr>
+    </w:p>
+    <w:p>
+      <w:pPr>
+        <w:spacing w:line="360" w:lineRule="auto"/>
+        <w:rPr>
+          <w:rFonts w:ascii="Times New Roman" w:hAnsi="Times New Roman" w:cs="Times New Roman"/>
+        </w:rPr>
+      </w:pPr>
+    </w:p>
+    <w:p>
+      <w:pPr>
+        <w:spacing w:line="360" w:lineRule="auto"/>
+        <w:rPr>
+          <w:rFonts w:ascii="Times New Roman" w:hAnsi="Times New Roman" w:cs="Times New Roman"/>
+        </w:rPr>
+      </w:pPr>
+      <w:r>
+        <w:rPr>
+          <w:rFonts w:ascii="Times New Roman" w:hAnsi="Times New Roman" w:cs="Times New Roman"/>
           <w:b/>
           <w:bCs/>
         </w:rPr>
+        <w:lastRenderedPageBreak/>
+        <w:t xml:space="preserve">Figure </w:t>
+      </w:r>
+      <w:del w:id="278" w:author="Stoycho Rusinov" w:date="2026-08-08T15:23:00Z">
+        <w:r>
+          <w:rPr>
+            <w:rFonts w:ascii="Times New Roman" w:hAnsi="Times New Roman" w:cs="Times New Roman"/>
+            <w:b/>
+            <w:bCs/>
+          </w:rPr>
+          <w:delText>10</w:delText>
+        </w:r>
+      </w:del>
+      <w:ins w:id="279" w:author="Stoycho Rusinov" w:date="2026-08-08T15:23:00Z">
+        <w:r>
+          <w:rPr>
+            <w:rFonts w:ascii="Times New Roman" w:hAnsi="Times New Roman" w:cs="Times New Roman"/>
+            <w:b/>
+            <w:bCs/>
+          </w:rPr>
+          <w:t>9</w:t>
+        </w:r>
+      </w:ins>
+      <w:r>
+        <w:rPr>
+          <w:rFonts w:ascii="Times New Roman" w:hAnsi="Times New Roman" w:cs="Times New Roman"/>
+          <w:b/>
+          <w:bCs/>
+        </w:rPr>
         <w:t>.</w:t>
       </w:r>
       <w:r>
@@ -19988,7 +19966,7 @@
           <w:noProof/>
         </w:rPr>
         <w:drawing>
-          <wp:inline distT="0" distB="0" distL="0" distR="0">
+          <wp:inline distT="0" distB="0" distL="0" distR="0" wp14:anchorId="189B0408" wp14:editId="0DF677E8">
             <wp:extent cx="5727700" cy="3272971"/>
             <wp:effectExtent l="0" t="0" r="0" b="0"/>
             <wp:docPr id="49" name="Picture"/>
@@ -20098,7 +20076,7 @@
         </w:rPr>
         <w:t xml:space="preserve"> Because the pre-treatment leads are jointly indistinguishable from zero (a joint Wald test gives p = 0.96) and are about two orders of magnitude smaller than the post-treatment coefficients, the loan-driven collapse in EU </w:t>
       </w:r>
-      <w:del w:id="278" w:author="Stoycho Rusinov" w:date="2026-08-08T15:23:00Z">
+      <w:del w:id="280" w:author="Stoycho Rusinov" w:date="2026-08-08T15:23:00Z">
         <w:r>
           <w:rPr>
             <w:rFonts w:ascii="Times New Roman" w:hAnsi="Times New Roman" w:cs="Times New Roman"/>
@@ -20106,7 +20084,7 @@
           <w:delText>applications</w:delText>
         </w:r>
       </w:del>
-      <w:ins w:id="279" w:author="Stoycho Rusinov" w:date="2026-08-08T15:23:00Z">
+      <w:ins w:id="281" w:author="Stoycho Rusinov" w:date="2026-08-08T15:23:00Z">
         <w:r>
           <w:rPr>
             <w:rFonts w:ascii="Times New Roman" w:hAnsi="Times New Roman" w:cs="Times New Roman"/>
@@ -20118,21 +20096,7 @@
         <w:rPr>
           <w:rFonts w:ascii="Times New Roman" w:hAnsi="Times New Roman" w:cs="Times New Roman"/>
         </w:rPr>
-        <w:t xml:space="preserve"> </w:t>
-      </w:r>
-      <w:proofErr w:type="gramStart"/>
-      <w:r>
-        <w:rPr>
-          <w:rFonts w:ascii="Times New Roman" w:hAnsi="Times New Roman" w:cs="Times New Roman"/>
-        </w:rPr>
-        <w:t>survives</w:t>
-      </w:r>
-      <w:proofErr w:type="gramEnd"/>
-      <w:r>
-        <w:rPr>
-          <w:rFonts w:ascii="Times New Roman" w:hAnsi="Times New Roman" w:cs="Times New Roman"/>
-        </w:rPr>
-        <w:t xml:space="preserve"> the relative-magnitudes sensitivity analysis across the full range of violations we examine. The robust </w:t>
+        <w:t xml:space="preserve"> survives the relative-magnitudes sensitivity analysis across the full range of violations we examine. The robust </w:t>
       </w:r>
       <w:r>
         <w:rPr>
@@ -23055,58 +23019,10 @@
         </w:rPr>
         <w:t xml:space="preserve"> across a range of starting incomes (Figure </w:t>
       </w:r>
-      <w:del w:id="280" w:author="Stoycho Rusinov" w:date="2026-08-08T15:23:00Z">
-        <w:r>
-          <w:rPr>
-            <w:rFonts w:ascii="Times New Roman" w:hAnsi="Times New Roman" w:cs="Times New Roman"/>
-          </w:rPr>
-          <w:delText>11</w:delText>
-        </w:r>
-      </w:del>
-      <w:ins w:id="281" w:author="Stoycho Rusinov" w:date="2026-08-08T15:23:00Z">
-        <w:r>
-          <w:rPr>
-            <w:rFonts w:ascii="Times New Roman" w:hAnsi="Times New Roman" w:cs="Times New Roman"/>
-          </w:rPr>
-          <w:t>10</w:t>
-        </w:r>
-      </w:ins>
-      <w:r>
-        <w:rPr>
-          <w:rFonts w:ascii="Times New Roman" w:hAnsi="Times New Roman" w:cs="Times New Roman"/>
-        </w:rPr>
-        <w:t>). When the loan has low present value (low expected earnings), Brexit is a large effective shock and the implied elasticity is mechanically smaller in magnitude (about −0.4). When the present value approaches the nominal amount (high earnings), the effective shock is smaller and the implied elasticity larger in magnitude.</w:t>
-      </w:r>
-    </w:p>
-    <w:p>
-      <w:pPr>
-        <w:spacing w:line="360" w:lineRule="auto"/>
-        <w:rPr>
-          <w:rFonts w:ascii="Times New Roman" w:hAnsi="Times New Roman" w:cs="Times New Roman"/>
-        </w:rPr>
-      </w:pPr>
-    </w:p>
-    <w:p>
-      <w:pPr>
-        <w:spacing w:line="360" w:lineRule="auto"/>
-        <w:rPr>
-          <w:rFonts w:ascii="Times New Roman" w:hAnsi="Times New Roman" w:cs="Times New Roman"/>
-        </w:rPr>
-      </w:pPr>
-      <w:r>
-        <w:rPr>
-          <w:rFonts w:ascii="Times New Roman" w:hAnsi="Times New Roman" w:cs="Times New Roman"/>
-          <w:b/>
-          <w:bCs/>
-        </w:rPr>
-        <w:t xml:space="preserve">Figure </w:t>
-      </w:r>
       <w:del w:id="282" w:author="Stoycho Rusinov" w:date="2026-08-08T15:23:00Z">
         <w:r>
           <w:rPr>
             <w:rFonts w:ascii="Times New Roman" w:hAnsi="Times New Roman" w:cs="Times New Roman"/>
-            <w:b/>
-            <w:bCs/>
           </w:rPr>
           <w:delText>11</w:delText>
         </w:r>
@@ -23115,8 +23031,6 @@
         <w:r>
           <w:rPr>
             <w:rFonts w:ascii="Times New Roman" w:hAnsi="Times New Roman" w:cs="Times New Roman"/>
-            <w:b/>
-            <w:bCs/>
           </w:rPr>
           <w:t>10</w:t>
         </w:r>
@@ -23124,9 +23038,59 @@
       <w:r>
         <w:rPr>
           <w:rFonts w:ascii="Times New Roman" w:hAnsi="Times New Roman" w:cs="Times New Roman"/>
+        </w:rPr>
+        <w:t>). When the loan has low present value (low expected earnings), Brexit is a large effective shock and the implied elasticity is mechanically smaller in magnitude (about −0.4). When the present value approaches the nominal amount (high earnings), the effective shock is smaller and the implied elasticity larger in magnitude.</w:t>
+      </w:r>
+    </w:p>
+    <w:p>
+      <w:pPr>
+        <w:spacing w:line="360" w:lineRule="auto"/>
+        <w:rPr>
+          <w:rFonts w:ascii="Times New Roman" w:hAnsi="Times New Roman" w:cs="Times New Roman"/>
+        </w:rPr>
+      </w:pPr>
+    </w:p>
+    <w:p>
+      <w:pPr>
+        <w:spacing w:line="360" w:lineRule="auto"/>
+        <w:rPr>
+          <w:rFonts w:ascii="Times New Roman" w:hAnsi="Times New Roman" w:cs="Times New Roman"/>
+        </w:rPr>
+      </w:pPr>
+      <w:r>
+        <w:rPr>
+          <w:rFonts w:ascii="Times New Roman" w:hAnsi="Times New Roman" w:cs="Times New Roman"/>
           <w:b/>
           <w:bCs/>
         </w:rPr>
+        <w:t xml:space="preserve">Figure </w:t>
+      </w:r>
+      <w:del w:id="284" w:author="Stoycho Rusinov" w:date="2026-08-08T15:23:00Z">
+        <w:r>
+          <w:rPr>
+            <w:rFonts w:ascii="Times New Roman" w:hAnsi="Times New Roman" w:cs="Times New Roman"/>
+            <w:b/>
+            <w:bCs/>
+          </w:rPr>
+          <w:delText>11</w:delText>
+        </w:r>
+      </w:del>
+      <w:ins w:id="285" w:author="Stoycho Rusinov" w:date="2026-08-08T15:23:00Z">
+        <w:r>
+          <w:rPr>
+            <w:rFonts w:ascii="Times New Roman" w:hAnsi="Times New Roman" w:cs="Times New Roman"/>
+            <w:b/>
+            <w:bCs/>
+          </w:rPr>
+          <w:t>10</w:t>
+        </w:r>
+      </w:ins>
+      <w:r>
+        <w:rPr>
+          <w:rFonts w:ascii="Times New Roman" w:hAnsi="Times New Roman" w:cs="Times New Roman"/>
+          <w:b/>
+          <w:bCs/>
+        </w:rPr>
         <w:t>.</w:t>
       </w:r>
       <w:r>
@@ -23149,7 +23113,7 @@
           <w:noProof/>
         </w:rPr>
         <w:drawing>
-          <wp:inline distT="0" distB="0" distL="0" distR="0">
+          <wp:inline distT="0" distB="0" distL="0" distR="0" wp14:anchorId="4362C052" wp14:editId="3E78D6BE">
             <wp:extent cx="5119494" cy="3656781"/>
             <wp:effectExtent l="0" t="0" r="0" b="0"/>
             <wp:docPr id="52" name="Picture"/>
@@ -23543,7 +23507,7 @@
         <w:lastRenderedPageBreak/>
         <w:t xml:space="preserve">recomputing the elasticities using heterogeneous price changes across the Union, the correlation with GDP per capita vanishes. Figure </w:t>
       </w:r>
-      <w:del w:id="284" w:author="Stoycho Rusinov" w:date="2026-08-08T15:23:00Z">
+      <w:del w:id="286" w:author="Stoycho Rusinov" w:date="2026-08-08T15:23:00Z">
         <w:r>
           <w:rPr>
             <w:rFonts w:ascii="Times New Roman" w:hAnsi="Times New Roman" w:cs="Times New Roman"/>
@@ -23551,7 +23515,7 @@
           <w:delText>12</w:delText>
         </w:r>
       </w:del>
-      <w:ins w:id="285" w:author="Stoycho Rusinov" w:date="2026-08-08T15:23:00Z">
+      <w:ins w:id="287" w:author="Stoycho Rusinov" w:date="2026-08-08T15:23:00Z">
         <w:r>
           <w:rPr>
             <w:rFonts w:ascii="Times New Roman" w:hAnsi="Times New Roman" w:cs="Times New Roman"/>
@@ -23656,7 +23620,7 @@
         </w:rPr>
         <w:t xml:space="preserve">Figure </w:t>
       </w:r>
-      <w:del w:id="286" w:author="Stoycho Rusinov" w:date="2026-08-08T15:23:00Z">
+      <w:del w:id="288" w:author="Stoycho Rusinov" w:date="2026-08-08T15:23:00Z">
         <w:r>
           <w:rPr>
             <w:rFonts w:ascii="Times New Roman" w:hAnsi="Times New Roman" w:cs="Times New Roman"/>
@@ -23666,7 +23630,7 @@
           <w:delText>12</w:delText>
         </w:r>
       </w:del>
-      <w:ins w:id="287" w:author="Stoycho Rusinov" w:date="2026-08-08T15:23:00Z">
+      <w:ins w:id="289" w:author="Stoycho Rusinov" w:date="2026-08-08T15:23:00Z">
         <w:r>
           <w:rPr>
             <w:rFonts w:ascii="Times New Roman" w:hAnsi="Times New Roman" w:cs="Times New Roman"/>
@@ -23704,7 +23668,7 @@
           <w:noProof/>
         </w:rPr>
         <w:drawing>
-          <wp:inline distT="0" distB="0" distL="0" distR="0">
+          <wp:inline distT="0" distB="0" distL="0" distR="0" wp14:anchorId="3CD2FF68" wp14:editId="059CFE18">
             <wp:extent cx="5727700" cy="4091214"/>
             <wp:effectExtent l="0" t="0" r="0" b="0"/>
             <wp:docPr id="55" name="Picture"/>
@@ -24042,7 +24006,7 @@
         <w:spacing w:line="360" w:lineRule="auto"/>
         <w:ind w:firstLine="720"/>
         <w:rPr>
-          <w:ins w:id="288" w:author="Stoycho Rusinov" w:date="2026-08-08T15:23:00Z"/>
+          <w:ins w:id="290" w:author="Stoycho Rusinov" w:date="2026-08-08T15:23:00Z"/>
           <w:rFonts w:ascii="Times New Roman" w:hAnsi="Times New Roman" w:cs="Times New Roman"/>
         </w:rPr>
       </w:pPr>
@@ -24333,7 +24297,7 @@
         </w:rPr>
         <w:t xml:space="preserve">Figure </w:t>
       </w:r>
-      <w:del w:id="289" w:author="Stoycho Rusinov" w:date="2026-08-08T15:23:00Z">
+      <w:del w:id="291" w:author="Stoycho Rusinov" w:date="2026-08-08T15:23:00Z">
         <w:r>
           <w:rPr>
             <w:rFonts w:ascii="Times New Roman" w:hAnsi="Times New Roman" w:cs="Times New Roman"/>
@@ -24343,7 +24307,7 @@
           <w:delText>13</w:delText>
         </w:r>
       </w:del>
-      <w:ins w:id="290" w:author="Stoycho Rusinov" w:date="2026-08-08T15:23:00Z">
+      <w:ins w:id="292" w:author="Stoycho Rusinov" w:date="2026-08-08T15:23:00Z">
         <w:r>
           <w:rPr>
             <w:rFonts w:ascii="Times New Roman" w:hAnsi="Times New Roman" w:cs="Times New Roman"/>
@@ -24381,7 +24345,7 @@
           <w:noProof/>
         </w:rPr>
         <w:drawing>
-          <wp:inline distT="0" distB="0" distL="0" distR="0">
+          <wp:inline distT="0" distB="0" distL="0" distR="0" wp14:anchorId="72CC92DE" wp14:editId="2D2B38AC">
             <wp:extent cx="5727700" cy="4091214"/>
             <wp:effectExtent l="0" t="0" r="0" b="0"/>
             <wp:docPr id="58" name="Picture"/>
@@ -24450,7 +24414,7 @@
         </w:rPr>
         <w:t xml:space="preserve">Figure </w:t>
       </w:r>
-      <w:del w:id="291" w:author="Stoycho Rusinov" w:date="2026-08-08T15:23:00Z">
+      <w:del w:id="293" w:author="Stoycho Rusinov" w:date="2026-08-08T15:23:00Z">
         <w:r>
           <w:rPr>
             <w:rFonts w:ascii="Times New Roman" w:hAnsi="Times New Roman" w:cs="Times New Roman"/>
@@ -24458,7 +24422,7 @@
           <w:delText>13</w:delText>
         </w:r>
       </w:del>
-      <w:ins w:id="292" w:author="Stoycho Rusinov" w:date="2026-08-08T15:23:00Z">
+      <w:ins w:id="294" w:author="Stoycho Rusinov" w:date="2026-08-08T15:23:00Z">
         <w:r>
           <w:rPr>
             <w:rFonts w:ascii="Times New Roman" w:hAnsi="Times New Roman" w:cs="Times New Roman"/>
@@ -24496,7 +24460,7 @@
         <w:lastRenderedPageBreak/>
         <w:t xml:space="preserve">The only variable that clearly moves the loan-corrected elasticity is education spending as a share of GDP, with a negative, significant coefficient and the largest explanatory power among those tested. Countries investing more in education show stronger residual price responsiveness to UK tuition increases, which also reframes the post-Brexit heterogeneity. Before correction, poorer countries looked most elastic because their </w:t>
       </w:r>
-      <w:del w:id="293" w:author="Stoycho Rusinov" w:date="2026-08-08T15:23:00Z">
+      <w:del w:id="295" w:author="Stoycho Rusinov" w:date="2026-08-08T15:23:00Z">
         <w:r>
           <w:rPr>
             <w:rFonts w:ascii="Times New Roman" w:hAnsi="Times New Roman" w:cs="Times New Roman"/>
@@ -24510,7 +24474,7 @@
         </w:rPr>
         <w:t xml:space="preserve">declines </w:t>
       </w:r>
-      <w:ins w:id="294" w:author="Stoycho Rusinov" w:date="2026-08-08T15:23:00Z">
+      <w:ins w:id="296" w:author="Stoycho Rusinov" w:date="2026-08-08T15:23:00Z">
         <w:r>
           <w:rPr>
             <w:rFonts w:ascii="Times New Roman" w:hAnsi="Times New Roman" w:cs="Times New Roman"/>
@@ -24554,7 +24518,7 @@
         <w:spacing w:line="360" w:lineRule="auto"/>
         <w:ind w:firstLine="720"/>
         <w:rPr>
-          <w:ins w:id="295" w:author="Stoycho Rusinov" w:date="2026-08-08T15:23:00Z"/>
+          <w:ins w:id="297" w:author="Stoycho Rusinov" w:date="2026-08-08T15:23:00Z"/>
           <w:rFonts w:ascii="Times New Roman" w:hAnsi="Times New Roman" w:cs="Times New Roman"/>
         </w:rPr>
       </w:pPr>
@@ -24730,12 +24694,12 @@
       <w:pPr>
         <w:spacing w:line="360" w:lineRule="auto"/>
         <w:rPr>
-          <w:moveTo w:id="296" w:author="Stoycho Rusinov" w:date="2026-08-08T15:23:00Z"/>
-          <w:rFonts w:ascii="Times New Roman" w:hAnsi="Times New Roman" w:cs="Times New Roman"/>
-        </w:rPr>
-      </w:pPr>
-      <w:moveToRangeStart w:id="297" w:author="Stoycho Rusinov" w:date="2026-08-08T15:23:00Z" w:name="move237095007"/>
-      <w:moveTo w:id="298" w:author="Stoycho Rusinov" w:date="2026-08-08T15:23:00Z">
+          <w:moveTo w:id="298" w:author="Stoycho Rusinov" w:date="2026-08-08T15:23:00Z"/>
+          <w:rFonts w:ascii="Times New Roman" w:hAnsi="Times New Roman" w:cs="Times New Roman"/>
+        </w:rPr>
+      </w:pPr>
+      <w:moveToRangeStart w:id="299" w:author="Stoycho Rusinov" w:date="2026-08-08T15:23:00Z" w:name="move237095007"/>
+      <w:moveTo w:id="300" w:author="Stoycho Rusinov" w:date="2026-08-08T15:23:00Z">
         <w:r>
           <w:rPr>
             <w:rFonts w:ascii="Times New Roman" w:hAnsi="Times New Roman" w:cs="Times New Roman"/>
@@ -24748,6 +24712,9 @@
         <w:r>
           <w:instrText xml:space="preserve"> HYPERLINK "https://doi.org/10.1257/jel.20191450" \h </w:instrText>
         </w:r>
+      </w:moveTo>
+      <w:ins w:id="301" w:author="Stoycho Rusinov" w:date="2026-08-08T15:23:00Z"/>
+      <w:moveTo w:id="302" w:author="Stoycho Rusinov" w:date="2026-08-08T15:23:00Z">
         <w:r>
           <w:fldChar w:fldCharType="separate"/>
         </w:r>
@@ -24767,27 +24734,19 @@
         </w:r>
       </w:moveTo>
     </w:p>
-    <w:moveToRangeEnd w:id="297"/>
-    <w:p>
-      <w:pPr>
-        <w:spacing w:line="360" w:lineRule="auto"/>
-        <w:rPr>
-          <w:rFonts w:ascii="Times New Roman" w:hAnsi="Times New Roman" w:cs="Times New Roman"/>
-        </w:rPr>
-      </w:pPr>
-      <w:proofErr w:type="spellStart"/>
-      <w:r>
-        <w:rPr>
-          <w:rFonts w:ascii="Times New Roman" w:hAnsi="Times New Roman" w:cs="Times New Roman"/>
-        </w:rPr>
-        <w:t>Arel-Bundock</w:t>
-      </w:r>
-      <w:proofErr w:type="spellEnd"/>
-      <w:r>
-        <w:rPr>
-          <w:rFonts w:ascii="Times New Roman" w:hAnsi="Times New Roman" w:cs="Times New Roman"/>
-        </w:rPr>
-        <w:t xml:space="preserve">, V. (2022). WDI: World Development Indicators and other World Bank data (R package version 2.7.8) [Computer software]. </w:t>
+    <w:moveToRangeEnd w:id="299"/>
+    <w:p>
+      <w:pPr>
+        <w:spacing w:line="360" w:lineRule="auto"/>
+        <w:rPr>
+          <w:rFonts w:ascii="Times New Roman" w:hAnsi="Times New Roman" w:cs="Times New Roman"/>
+        </w:rPr>
+      </w:pPr>
+      <w:r>
+        <w:rPr>
+          <w:rFonts w:ascii="Times New Roman" w:hAnsi="Times New Roman" w:cs="Times New Roman"/>
+        </w:rPr>
+        <w:t xml:space="preserve">Arel-Bundock, V. (2022). WDI: World Development Indicators and other World Bank data (R package version 2.7.8) [Computer software]. </w:t>
       </w:r>
       <w:hyperlink r:id="rId21">
         <w:r>
@@ -24877,12 +24836,12 @@
       <w:pPr>
         <w:spacing w:line="360" w:lineRule="auto"/>
         <w:rPr>
-          <w:moveFrom w:id="299" w:author="Stoycho Rusinov" w:date="2026-08-08T15:23:00Z"/>
-          <w:rFonts w:ascii="Times New Roman" w:hAnsi="Times New Roman" w:cs="Times New Roman"/>
-        </w:rPr>
-      </w:pPr>
-      <w:moveFromRangeStart w:id="300" w:author="Stoycho Rusinov" w:date="2026-08-08T15:23:00Z" w:name="move237095007"/>
-      <w:moveFrom w:id="301" w:author="Stoycho Rusinov" w:date="2026-08-08T15:23:00Z">
+          <w:moveFrom w:id="303" w:author="Stoycho Rusinov" w:date="2026-08-08T15:23:00Z"/>
+          <w:rFonts w:ascii="Times New Roman" w:hAnsi="Times New Roman" w:cs="Times New Roman"/>
+        </w:rPr>
+      </w:pPr>
+      <w:moveFromRangeStart w:id="304" w:author="Stoycho Rusinov" w:date="2026-08-08T15:23:00Z" w:name="move237095007"/>
+      <w:moveFrom w:id="305" w:author="Stoycho Rusinov" w:date="2026-08-08T15:23:00Z">
         <w:r>
           <w:rPr>
             <w:rFonts w:ascii="Times New Roman" w:hAnsi="Times New Roman" w:cs="Times New Roman"/>
@@ -24895,6 +24854,9 @@
         <w:r>
           <w:instrText xml:space="preserve"> HYPERLINK "https://doi.org/10.1257/jel.20191450" \h </w:instrText>
         </w:r>
+      </w:moveFrom>
+      <w:del w:id="306" w:author="Stoycho Rusinov" w:date="2026-08-08T15:23:00Z"/>
+      <w:moveFrom w:id="307" w:author="Stoycho Rusinov" w:date="2026-08-08T15:23:00Z">
         <w:r>
           <w:fldChar w:fldCharType="separate"/>
         </w:r>
@@ -24914,16 +24876,16 @@
         </w:r>
       </w:moveFrom>
     </w:p>
-    <w:moveFromRangeEnd w:id="300"/>
-    <w:p>
-      <w:pPr>
-        <w:spacing w:line="360" w:lineRule="auto"/>
-        <w:rPr>
-          <w:del w:id="302" w:author="Stoycho Rusinov" w:date="2026-08-08T15:23:00Z"/>
-          <w:rFonts w:ascii="Times New Roman" w:hAnsi="Times New Roman" w:cs="Times New Roman"/>
-        </w:rPr>
-      </w:pPr>
-      <w:del w:id="303" w:author="Stoycho Rusinov" w:date="2026-08-08T15:23:00Z">
+    <w:moveFromRangeEnd w:id="304"/>
+    <w:p>
+      <w:pPr>
+        <w:spacing w:line="360" w:lineRule="auto"/>
+        <w:rPr>
+          <w:del w:id="308" w:author="Stoycho Rusinov" w:date="2026-08-08T15:23:00Z"/>
+          <w:rFonts w:ascii="Times New Roman" w:hAnsi="Times New Roman" w:cs="Times New Roman"/>
+        </w:rPr>
+      </w:pPr>
+      <w:del w:id="309" w:author="Stoycho Rusinov" w:date="2026-08-08T15:23:00Z">
         <w:r>
           <w:rPr>
             <w:rFonts w:ascii="Times New Roman" w:hAnsi="Times New Roman" w:cs="Times New Roman"/>
@@ -24973,11 +24935,11 @@
       <w:pPr>
         <w:spacing w:line="360" w:lineRule="auto"/>
         <w:rPr>
-          <w:del w:id="304" w:author="Stoycho Rusinov" w:date="2026-08-08T15:23:00Z"/>
-          <w:rFonts w:ascii="Times New Roman" w:hAnsi="Times New Roman" w:cs="Times New Roman"/>
-        </w:rPr>
-      </w:pPr>
-      <w:del w:id="305" w:author="Stoycho Rusinov" w:date="2026-08-08T15:23:00Z">
+          <w:del w:id="310" w:author="Stoycho Rusinov" w:date="2026-08-08T15:23:00Z"/>
+          <w:rFonts w:ascii="Times New Roman" w:hAnsi="Times New Roman" w:cs="Times New Roman"/>
+        </w:rPr>
+      </w:pPr>
+      <w:del w:id="311" w:author="Stoycho Rusinov" w:date="2026-08-08T15:23:00Z">
         <w:r>
           <w:rPr>
             <w:rFonts w:ascii="Times New Roman" w:hAnsi="Times New Roman" w:cs="Times New Roman"/>
@@ -25101,7 +25063,7 @@
         </w:rPr>
         <w:t xml:space="preserve">Campbell, R., &amp; Siegel, B. (1967). The </w:t>
       </w:r>
-      <w:del w:id="306" w:author="Stoycho Rusinov" w:date="2026-08-08T15:23:00Z">
+      <w:del w:id="312" w:author="Stoycho Rusinov" w:date="2026-08-08T15:23:00Z">
         <w:r>
           <w:rPr>
             <w:rFonts w:ascii="Times New Roman" w:hAnsi="Times New Roman" w:cs="Times New Roman"/>
@@ -25109,7 +25071,7 @@
           <w:delText>Demand</w:delText>
         </w:r>
       </w:del>
-      <w:ins w:id="307" w:author="Stoycho Rusinov" w:date="2026-08-08T15:23:00Z">
+      <w:ins w:id="313" w:author="Stoycho Rusinov" w:date="2026-08-08T15:23:00Z">
         <w:r>
           <w:rPr>
             <w:rFonts w:ascii="Times New Roman" w:hAnsi="Times New Roman" w:cs="Times New Roman"/>
@@ -25189,31 +25151,17 @@
       <w:pPr>
         <w:spacing w:line="360" w:lineRule="auto"/>
         <w:rPr>
-          <w:moveTo w:id="308" w:author="Stoycho Rusinov" w:date="2026-08-08T15:23:00Z"/>
-          <w:rFonts w:ascii="Times New Roman" w:hAnsi="Times New Roman" w:cs="Times New Roman"/>
-        </w:rPr>
-      </w:pPr>
-      <w:moveToRangeStart w:id="309" w:author="Stoycho Rusinov" w:date="2026-08-08T15:23:00Z" w:name="move237095008"/>
-      <w:moveTo w:id="310" w:author="Stoycho Rusinov" w:date="2026-08-08T15:23:00Z">
+          <w:moveTo w:id="314" w:author="Stoycho Rusinov" w:date="2026-08-08T15:23:00Z"/>
+          <w:rFonts w:ascii="Times New Roman" w:hAnsi="Times New Roman" w:cs="Times New Roman"/>
+        </w:rPr>
+      </w:pPr>
+      <w:moveToRangeStart w:id="315" w:author="Stoycho Rusinov" w:date="2026-08-08T15:23:00Z" w:name="move237095008"/>
+      <w:moveTo w:id="316" w:author="Stoycho Rusinov" w:date="2026-08-08T15:23:00Z">
         <w:r>
           <w:rPr>
             <w:rFonts w:ascii="Times New Roman" w:hAnsi="Times New Roman" w:cs="Times New Roman"/>
           </w:rPr>
-          <w:t xml:space="preserve">Conlon, G., </w:t>
-        </w:r>
-        <w:proofErr w:type="spellStart"/>
-        <w:r>
-          <w:rPr>
-            <w:rFonts w:ascii="Times New Roman" w:hAnsi="Times New Roman" w:cs="Times New Roman"/>
-          </w:rPr>
-          <w:t>Lader</w:t>
-        </w:r>
-        <w:proofErr w:type="spellEnd"/>
-        <w:r>
-          <w:rPr>
-            <w:rFonts w:ascii="Times New Roman" w:hAnsi="Times New Roman" w:cs="Times New Roman"/>
-          </w:rPr>
-          <w:t xml:space="preserve">, R., </w:t>
+          <w:t xml:space="preserve">Conlon, G., Lader, R., </w:t>
         </w:r>
         <w:proofErr w:type="spellStart"/>
         <w:r>
@@ -25235,6 +25183,9 @@
         <w:r>
           <w:instrText xml:space="preserve"> HYPERLINK "https://assets.publishing.service.gov.uk/government/uploads/system/uploads/attachment_data/file/958998/EU_exit_estimating_the_impact_on_UK_higher_education.pdf" \h </w:instrText>
         </w:r>
+      </w:moveTo>
+      <w:ins w:id="317" w:author="Stoycho Rusinov" w:date="2026-08-08T15:23:00Z"/>
+      <w:moveTo w:id="318" w:author="Stoycho Rusinov" w:date="2026-08-08T15:23:00Z">
         <w:r>
           <w:fldChar w:fldCharType="separate"/>
         </w:r>
@@ -25243,16 +25194,7 @@
             <w:rStyle w:val="Hyperlink"/>
             <w:rFonts w:ascii="Times New Roman" w:hAnsi="Times New Roman" w:cs="Times New Roman"/>
           </w:rPr>
-          <w:t>https://assets.publishing.service.gov.uk/government/uploads/system/uploads/attachment_data/file/958998/EU_exit_estimating_the_impact_on_UK</w:t>
-        </w:r>
-        <w:bookmarkStart w:id="311" w:name="_GoBack"/>
-        <w:bookmarkEnd w:id="311"/>
-        <w:r>
-          <w:rPr>
-            <w:rStyle w:val="Hyperlink"/>
-            <w:rFonts w:ascii="Times New Roman" w:hAnsi="Times New Roman" w:cs="Times New Roman"/>
-          </w:rPr>
-          <w:t>_higher_education.pdf</w:t>
+          <w:t>https://assets.publishing.service.gov.uk/government/uploads/system/uploads/attachment_data/file/958998/EU_exit_estimating_the_impact_on_UK_higher_education.pdf</w:t>
         </w:r>
         <w:r>
           <w:rPr>
@@ -25263,35 +25205,21 @@
         </w:r>
       </w:moveTo>
     </w:p>
-    <w:moveToRangeEnd w:id="309"/>
-    <w:p>
-      <w:pPr>
-        <w:spacing w:line="360" w:lineRule="auto"/>
-        <w:rPr>
-          <w:ins w:id="312" w:author="Stoycho Rusinov" w:date="2026-08-08T15:23:00Z"/>
-          <w:rFonts w:ascii="Times New Roman" w:hAnsi="Times New Roman" w:cs="Times New Roman"/>
-        </w:rPr>
-      </w:pPr>
-      <w:ins w:id="313" w:author="Stoycho Rusinov" w:date="2026-08-08T15:23:00Z">
+    <w:moveToRangeEnd w:id="315"/>
+    <w:p>
+      <w:pPr>
+        <w:spacing w:line="360" w:lineRule="auto"/>
+        <w:rPr>
+          <w:ins w:id="319" w:author="Stoycho Rusinov" w:date="2026-08-08T15:23:00Z"/>
+          <w:rFonts w:ascii="Times New Roman" w:hAnsi="Times New Roman" w:cs="Times New Roman"/>
+        </w:rPr>
+      </w:pPr>
+      <w:ins w:id="320" w:author="Stoycho Rusinov" w:date="2026-08-08T15:23:00Z">
         <w:r>
           <w:rPr>
             <w:rFonts w:ascii="Times New Roman" w:hAnsi="Times New Roman" w:cs="Times New Roman"/>
           </w:rPr>
-          <w:t xml:space="preserve">Crawford, C., Maris, R., Petit, F., &amp; </w:t>
-        </w:r>
-        <w:proofErr w:type="spellStart"/>
-        <w:r>
-          <w:rPr>
-            <w:rFonts w:ascii="Times New Roman" w:hAnsi="Times New Roman" w:cs="Times New Roman"/>
-          </w:rPr>
-          <w:t>Wyness</w:t>
-        </w:r>
-        <w:proofErr w:type="spellEnd"/>
-        <w:r>
-          <w:rPr>
-            <w:rFonts w:ascii="Times New Roman" w:hAnsi="Times New Roman" w:cs="Times New Roman"/>
-          </w:rPr>
-          <w:t xml:space="preserve">, G. (2025). Degrees of demand: Price elasticity in higher education (CEPEO Working Paper Series No. 25-13). UCL Centre for Education Policy and </w:t>
+          <w:t xml:space="preserve">Crawford, C., Maris, R., Petit, F., &amp; Wyness, G. (2025). Degrees of demand: Price elasticity in higher education (CEPEO Working Paper Series No. 25-13). UCL Centre for Education Policy and </w:t>
         </w:r>
         <w:proofErr w:type="spellStart"/>
         <w:r>
@@ -25330,7 +25258,7 @@
         </w:rPr>
         <w:t xml:space="preserve">, M., </w:t>
       </w:r>
-      <w:del w:id="314" w:author="Stoycho Rusinov" w:date="2026-08-08T15:23:00Z">
+      <w:del w:id="321" w:author="Stoycho Rusinov" w:date="2026-08-08T15:23:00Z">
         <w:r>
           <w:rPr>
             <w:rFonts w:ascii="Times New Roman" w:hAnsi="Times New Roman" w:cs="Times New Roman"/>
@@ -25344,7 +25272,7 @@
         </w:rPr>
         <w:t>Walsh, P. W</w:t>
       </w:r>
-      <w:del w:id="315" w:author="Stoycho Rusinov" w:date="2026-08-08T15:23:00Z">
+      <w:del w:id="322" w:author="Stoycho Rusinov" w:date="2026-08-08T15:23:00Z">
         <w:r>
           <w:rPr>
             <w:rFonts w:ascii="Times New Roman" w:hAnsi="Times New Roman" w:cs="Times New Roman"/>
@@ -25352,7 +25280,7 @@
           <w:delText>.</w:delText>
         </w:r>
       </w:del>
-      <w:ins w:id="316" w:author="Stoycho Rusinov" w:date="2026-08-08T15:23:00Z">
+      <w:ins w:id="323" w:author="Stoycho Rusinov" w:date="2026-08-08T15:23:00Z">
         <w:r>
           <w:rPr>
             <w:rFonts w:ascii="Times New Roman" w:hAnsi="Times New Roman" w:cs="Times New Roman"/>
@@ -25364,17 +25292,9 @@
         <w:rPr>
           <w:rFonts w:ascii="Times New Roman" w:hAnsi="Times New Roman" w:cs="Times New Roman"/>
         </w:rPr>
-        <w:t xml:space="preserve"> &amp; </w:t>
-      </w:r>
-      <w:proofErr w:type="spellStart"/>
-      <w:r>
-        <w:rPr>
-          <w:rFonts w:ascii="Times New Roman" w:hAnsi="Times New Roman" w:cs="Times New Roman"/>
-        </w:rPr>
-        <w:t>Němeček</w:t>
-      </w:r>
-      <w:proofErr w:type="spellEnd"/>
-      <w:ins w:id="317" w:author="Stoycho Rusinov" w:date="2026-08-08T15:23:00Z">
+        <w:t xml:space="preserve"> &amp; Němeček</w:t>
+      </w:r>
+      <w:ins w:id="324" w:author="Stoycho Rusinov" w:date="2026-08-08T15:23:00Z">
         <w:r>
           <w:rPr>
             <w:rFonts w:ascii="Times New Roman" w:hAnsi="Times New Roman" w:cs="Times New Roman"/>
@@ -25476,12 +25396,12 @@
       <w:pPr>
         <w:spacing w:line="360" w:lineRule="auto"/>
         <w:rPr>
-          <w:moveTo w:id="318" w:author="Stoycho Rusinov" w:date="2026-08-08T15:23:00Z"/>
-          <w:rFonts w:ascii="Times New Roman" w:hAnsi="Times New Roman" w:cs="Times New Roman"/>
-        </w:rPr>
-      </w:pPr>
-      <w:moveToRangeStart w:id="319" w:author="Stoycho Rusinov" w:date="2026-08-08T15:23:00Z" w:name="move237095009"/>
-      <w:moveTo w:id="320" w:author="Stoycho Rusinov" w:date="2026-08-08T15:23:00Z">
+          <w:moveTo w:id="325" w:author="Stoycho Rusinov" w:date="2026-08-08T15:23:00Z"/>
+          <w:rFonts w:ascii="Times New Roman" w:hAnsi="Times New Roman" w:cs="Times New Roman"/>
+        </w:rPr>
+      </w:pPr>
+      <w:moveToRangeStart w:id="326" w:author="Stoycho Rusinov" w:date="2026-08-08T15:23:00Z" w:name="move237095009"/>
+      <w:moveTo w:id="327" w:author="Stoycho Rusinov" w:date="2026-08-08T15:23:00Z">
         <w:r>
           <w:rPr>
             <w:rFonts w:ascii="Times New Roman" w:hAnsi="Times New Roman" w:cs="Times New Roman"/>
@@ -25494,6 +25414,9 @@
         <w:r>
           <w:instrText xml:space="preserve"> HYPERLINK "https://www.ecb.europa.eu/press/pr/date/2021/html/ecb.pr210708~dc78cc4b0d.en.html" \h </w:instrText>
         </w:r>
+      </w:moveTo>
+      <w:ins w:id="328" w:author="Stoycho Rusinov" w:date="2026-08-08T15:23:00Z"/>
+      <w:moveTo w:id="329" w:author="Stoycho Rusinov" w:date="2026-08-08T15:23:00Z">
         <w:r>
           <w:fldChar w:fldCharType="separate"/>
         </w:r>
@@ -25513,7 +25436,7 @@
         </w:r>
       </w:moveTo>
     </w:p>
-    <w:moveToRangeEnd w:id="319"/>
+    <w:moveToRangeEnd w:id="326"/>
     <w:p>
       <w:pPr>
         <w:spacing w:line="360" w:lineRule="auto"/>
@@ -25667,12 +25590,12 @@
       <w:pPr>
         <w:spacing w:line="360" w:lineRule="auto"/>
         <w:rPr>
-          <w:ins w:id="321" w:author="Stoycho Rusinov" w:date="2026-08-08T15:23:00Z"/>
-          <w:rFonts w:ascii="Times New Roman" w:hAnsi="Times New Roman" w:cs="Times New Roman"/>
-        </w:rPr>
-      </w:pPr>
-      <w:moveToRangeStart w:id="322" w:author="Stoycho Rusinov" w:date="2026-08-08T15:23:00Z" w:name="move237095010"/>
-      <w:moveTo w:id="323" w:author="Stoycho Rusinov" w:date="2026-08-08T15:23:00Z">
+          <w:ins w:id="330" w:author="Stoycho Rusinov" w:date="2026-08-08T15:23:00Z"/>
+          <w:rFonts w:ascii="Times New Roman" w:hAnsi="Times New Roman" w:cs="Times New Roman"/>
+        </w:rPr>
+      </w:pPr>
+      <w:moveToRangeStart w:id="331" w:author="Stoycho Rusinov" w:date="2026-08-08T15:23:00Z" w:name="move237095010"/>
+      <w:moveTo w:id="332" w:author="Stoycho Rusinov" w:date="2026-08-08T15:23:00Z">
         <w:r>
           <w:rPr>
             <w:rFonts w:ascii="Times New Roman" w:hAnsi="Times New Roman" w:cs="Times New Roman"/>
@@ -25685,6 +25608,9 @@
         <w:r>
           <w:instrText xml:space="preserve"> HYPERLINK "https://www.gov.uk/government/news/graduate-route-for-best-and-brightest-launches" \h </w:instrText>
         </w:r>
+      </w:moveTo>
+      <w:ins w:id="333" w:author="Stoycho Rusinov" w:date="2026-08-08T15:23:00Z"/>
+      <w:moveTo w:id="334" w:author="Stoycho Rusinov" w:date="2026-08-08T15:23:00Z">
         <w:r>
           <w:fldChar w:fldCharType="separate"/>
         </w:r>
@@ -25704,28 +25630,20 @@
         </w:r>
       </w:moveTo>
       <w:bookmarkEnd w:id="0"/>
-      <w:moveToRangeEnd w:id="322"/>
-    </w:p>
-    <w:p>
-      <w:pPr>
-        <w:spacing w:line="360" w:lineRule="auto"/>
-        <w:rPr>
-          <w:rFonts w:ascii="Times New Roman" w:hAnsi="Times New Roman" w:cs="Times New Roman"/>
-        </w:rPr>
-      </w:pPr>
-      <w:proofErr w:type="spellStart"/>
-      <w:r>
-        <w:rPr>
-          <w:rFonts w:ascii="Times New Roman" w:hAnsi="Times New Roman" w:cs="Times New Roman"/>
-        </w:rPr>
-        <w:t>Hoxby</w:t>
-      </w:r>
-      <w:proofErr w:type="spellEnd"/>
-      <w:r>
-        <w:rPr>
-          <w:rFonts w:ascii="Times New Roman" w:hAnsi="Times New Roman" w:cs="Times New Roman"/>
-        </w:rPr>
-        <w:t xml:space="preserve">, C. M. (1997). </w:t>
+      <w:moveToRangeEnd w:id="331"/>
+    </w:p>
+    <w:p>
+      <w:pPr>
+        <w:spacing w:line="360" w:lineRule="auto"/>
+        <w:rPr>
+          <w:rFonts w:ascii="Times New Roman" w:hAnsi="Times New Roman" w:cs="Times New Roman"/>
+        </w:rPr>
+      </w:pPr>
+      <w:r>
+        <w:rPr>
+          <w:rFonts w:ascii="Times New Roman" w:hAnsi="Times New Roman" w:cs="Times New Roman"/>
+        </w:rPr>
+        <w:t xml:space="preserve">Hoxby, C. M. (1997). </w:t>
       </w:r>
       <w:r>
         <w:rPr>
@@ -25778,7 +25696,7 @@
       <w:pPr>
         <w:spacing w:line="360" w:lineRule="auto"/>
         <w:rPr>
-          <w:del w:id="324" w:author="Stoycho Rusinov" w:date="2026-08-08T15:23:00Z"/>
+          <w:del w:id="335" w:author="Stoycho Rusinov" w:date="2026-08-08T15:23:00Z"/>
           <w:rFonts w:ascii="Times New Roman" w:hAnsi="Times New Roman" w:cs="Times New Roman"/>
         </w:rPr>
       </w:pPr>
@@ -25788,7 +25706,7 @@
         </w:rPr>
         <w:t xml:space="preserve">Leslie, </w:t>
       </w:r>
-      <w:del w:id="325" w:author="Stoycho Rusinov" w:date="2026-08-08T15:23:00Z">
+      <w:del w:id="336" w:author="Stoycho Rusinov" w:date="2026-08-08T15:23:00Z">
         <w:r>
           <w:rPr>
             <w:rFonts w:ascii="Times New Roman" w:hAnsi="Times New Roman" w:cs="Times New Roman"/>
@@ -25841,7 +25759,7 @@
           <w:rFonts w:ascii="Times New Roman" w:hAnsi="Times New Roman" w:cs="Times New Roman"/>
         </w:rPr>
       </w:pPr>
-      <w:del w:id="326" w:author="Stoycho Rusinov" w:date="2026-08-08T15:23:00Z">
+      <w:del w:id="337" w:author="Stoycho Rusinov" w:date="2026-08-08T15:23:00Z">
         <w:r>
           <w:rPr>
             <w:rFonts w:ascii="Times New Roman" w:hAnsi="Times New Roman" w:cs="Times New Roman"/>
@@ -26068,13 +25986,13 @@
       <w:pPr>
         <w:spacing w:line="360" w:lineRule="auto"/>
         <w:rPr>
-          <w:moveTo w:id="327" w:author="Stoycho Rusinov" w:date="2026-08-08T15:23:00Z"/>
-          <w:rFonts w:ascii="Times New Roman" w:hAnsi="Times New Roman" w:cs="Times New Roman"/>
-        </w:rPr>
-      </w:pPr>
-      <w:moveToRangeStart w:id="328" w:author="Stoycho Rusinov" w:date="2026-08-08T15:23:00Z" w:name="move237095011"/>
+          <w:moveTo w:id="338" w:author="Stoycho Rusinov" w:date="2026-08-08T15:23:00Z"/>
+          <w:rFonts w:ascii="Times New Roman" w:hAnsi="Times New Roman" w:cs="Times New Roman"/>
+        </w:rPr>
+      </w:pPr>
+      <w:moveToRangeStart w:id="339" w:author="Stoycho Rusinov" w:date="2026-08-08T15:23:00Z" w:name="move237095011"/>
       <w:proofErr w:type="spellStart"/>
-      <w:moveTo w:id="329" w:author="Stoycho Rusinov" w:date="2026-08-08T15:23:00Z">
+      <w:moveTo w:id="340" w:author="Stoycho Rusinov" w:date="2026-08-08T15:23:00Z">
         <w:r>
           <w:rPr>
             <w:rFonts w:ascii="Times New Roman" w:hAnsi="Times New Roman" w:cs="Times New Roman"/>
@@ -26094,6 +26012,9 @@
         <w:r>
           <w:instrText xml:space="preserve"> HYPERLINK "https://www.publicfirst.co.uk/couting-the-cost" \h </w:instrText>
         </w:r>
+      </w:moveTo>
+      <w:ins w:id="341" w:author="Stoycho Rusinov" w:date="2026-08-08T15:23:00Z"/>
+      <w:moveTo w:id="342" w:author="Stoycho Rusinov" w:date="2026-08-08T15:23:00Z">
         <w:r>
           <w:fldChar w:fldCharType="separate"/>
         </w:r>
@@ -26113,7 +26034,7 @@
         </w:r>
       </w:moveTo>
     </w:p>
-    <w:moveToRangeEnd w:id="328"/>
+    <w:moveToRangeEnd w:id="339"/>
     <w:p>
       <w:pPr>
         <w:spacing w:line="360" w:lineRule="auto"/>
@@ -26226,12 +26147,12 @@
       <w:pPr>
         <w:spacing w:line="360" w:lineRule="auto"/>
         <w:rPr>
-          <w:moveTo w:id="330" w:author="Stoycho Rusinov" w:date="2026-08-08T15:23:00Z"/>
-          <w:rFonts w:ascii="Times New Roman" w:hAnsi="Times New Roman" w:cs="Times New Roman"/>
-        </w:rPr>
-      </w:pPr>
-      <w:moveToRangeStart w:id="331" w:author="Stoycho Rusinov" w:date="2026-08-08T15:23:00Z" w:name="move237095012"/>
-      <w:moveTo w:id="332" w:author="Stoycho Rusinov" w:date="2026-08-08T15:23:00Z">
+          <w:moveTo w:id="343" w:author="Stoycho Rusinov" w:date="2026-08-08T15:23:00Z"/>
+          <w:rFonts w:ascii="Times New Roman" w:hAnsi="Times New Roman" w:cs="Times New Roman"/>
+        </w:rPr>
+      </w:pPr>
+      <w:moveToRangeStart w:id="344" w:author="Stoycho Rusinov" w:date="2026-08-08T15:23:00Z" w:name="move237095012"/>
+      <w:moveTo w:id="345" w:author="Stoycho Rusinov" w:date="2026-08-08T15:23:00Z">
         <w:r>
           <w:rPr>
             <w:rFonts w:ascii="Times New Roman" w:hAnsi="Times New Roman" w:cs="Times New Roman"/>
@@ -26244,6 +26165,9 @@
         <w:r>
           <w:instrText xml:space="preserve"> HYPERLINK "https://doi.org/10.2139/ssrn.2481553" \h </w:instrText>
         </w:r>
+      </w:moveTo>
+      <w:ins w:id="346" w:author="Stoycho Rusinov" w:date="2026-08-08T15:23:00Z"/>
+      <w:moveTo w:id="347" w:author="Stoycho Rusinov" w:date="2026-08-08T15:23:00Z">
         <w:r>
           <w:fldChar w:fldCharType="separate"/>
         </w:r>
@@ -26267,11 +26191,11 @@
       <w:pPr>
         <w:spacing w:line="360" w:lineRule="auto"/>
         <w:rPr>
-          <w:moveTo w:id="333" w:author="Stoycho Rusinov" w:date="2026-08-08T15:23:00Z"/>
-          <w:rFonts w:ascii="Times New Roman" w:hAnsi="Times New Roman" w:cs="Times New Roman"/>
-        </w:rPr>
-      </w:pPr>
-      <w:moveTo w:id="334" w:author="Stoycho Rusinov" w:date="2026-08-08T15:23:00Z">
+          <w:moveTo w:id="348" w:author="Stoycho Rusinov" w:date="2026-08-08T15:23:00Z"/>
+          <w:rFonts w:ascii="Times New Roman" w:hAnsi="Times New Roman" w:cs="Times New Roman"/>
+        </w:rPr>
+      </w:pPr>
+      <w:moveTo w:id="349" w:author="Stoycho Rusinov" w:date="2026-08-08T15:23:00Z">
         <w:r>
           <w:rPr>
             <w:rFonts w:ascii="Times New Roman" w:hAnsi="Times New Roman" w:cs="Times New Roman"/>
@@ -26284,6 +26208,9 @@
         <w:r>
           <w:instrText xml:space="preserve"> HYPERLINK "https://kclpure.kcl.ac.uk/ws/files/97277490/The_E_ect_of_University_Fees_SA_Accepted13July2017_GREEN_AAM.pdf" \h </w:instrText>
         </w:r>
+      </w:moveTo>
+      <w:ins w:id="350" w:author="Stoycho Rusinov" w:date="2026-08-08T15:23:00Z"/>
+      <w:moveTo w:id="351" w:author="Stoycho Rusinov" w:date="2026-08-08T15:23:00Z">
         <w:r>
           <w:fldChar w:fldCharType="separate"/>
         </w:r>
@@ -26307,30 +26234,16 @@
       <w:pPr>
         <w:spacing w:line="360" w:lineRule="auto"/>
         <w:rPr>
-          <w:moveTo w:id="335" w:author="Stoycho Rusinov" w:date="2026-08-08T15:23:00Z"/>
-          <w:rFonts w:ascii="Times New Roman" w:hAnsi="Times New Roman" w:cs="Times New Roman"/>
-        </w:rPr>
-      </w:pPr>
-      <w:moveTo w:id="336" w:author="Stoycho Rusinov" w:date="2026-08-08T15:23:00Z">
+          <w:moveTo w:id="352" w:author="Stoycho Rusinov" w:date="2026-08-08T15:23:00Z"/>
+          <w:rFonts w:ascii="Times New Roman" w:hAnsi="Times New Roman" w:cs="Times New Roman"/>
+        </w:rPr>
+      </w:pPr>
+      <w:moveTo w:id="353" w:author="Stoycho Rusinov" w:date="2026-08-08T15:23:00Z">
         <w:r>
           <w:rPr>
             <w:rFonts w:ascii="Times New Roman" w:hAnsi="Times New Roman" w:cs="Times New Roman"/>
           </w:rPr>
-          <w:t xml:space="preserve">Sá, F. (2019). The effect of university fees on applications, attendance and course choice: Evidence from a natural experiment in the UK. </w:t>
-        </w:r>
-        <w:proofErr w:type="spellStart"/>
-        <w:r>
-          <w:rPr>
-            <w:rFonts w:ascii="Times New Roman" w:hAnsi="Times New Roman" w:cs="Times New Roman"/>
-          </w:rPr>
-          <w:t>Economica</w:t>
-        </w:r>
-        <w:proofErr w:type="spellEnd"/>
-        <w:r>
-          <w:rPr>
-            <w:rFonts w:ascii="Times New Roman" w:hAnsi="Times New Roman" w:cs="Times New Roman"/>
-          </w:rPr>
-          <w:t xml:space="preserve">, 86(343), 607–634. </w:t>
+          <w:t xml:space="preserve">Sá, F. (2019). The effect of university fees on applications, attendance and course choice: Evidence from a natural experiment in the UK. Economica, 86(343), 607–634. </w:t>
         </w:r>
         <w:r>
           <w:fldChar w:fldCharType="begin"/>
@@ -26338,6 +26251,9 @@
         <w:r>
           <w:instrText xml:space="preserve"> HYPERLINK "https://doi.org/10.1111/ecca.12278" \h </w:instrText>
         </w:r>
+      </w:moveTo>
+      <w:ins w:id="354" w:author="Stoycho Rusinov" w:date="2026-08-08T15:23:00Z"/>
+      <w:moveTo w:id="355" w:author="Stoycho Rusinov" w:date="2026-08-08T15:23:00Z">
         <w:r>
           <w:fldChar w:fldCharType="separate"/>
         </w:r>
@@ -26357,27 +26273,19 @@
         </w:r>
       </w:moveTo>
     </w:p>
-    <w:moveToRangeEnd w:id="331"/>
-    <w:p>
-      <w:pPr>
-        <w:spacing w:line="360" w:lineRule="auto"/>
-        <w:rPr>
-          <w:rFonts w:ascii="Times New Roman" w:hAnsi="Times New Roman" w:cs="Times New Roman"/>
-        </w:rPr>
-      </w:pPr>
-      <w:proofErr w:type="spellStart"/>
-      <w:r>
-        <w:rPr>
-          <w:rFonts w:ascii="Times New Roman" w:hAnsi="Times New Roman" w:cs="Times New Roman"/>
-        </w:rPr>
-        <w:t>Savoca</w:t>
-      </w:r>
-      <w:proofErr w:type="spellEnd"/>
-      <w:r>
-        <w:rPr>
-          <w:rFonts w:ascii="Times New Roman" w:hAnsi="Times New Roman" w:cs="Times New Roman"/>
-        </w:rPr>
-        <w:t xml:space="preserve">, E. (1990). Another look at the demand for higher education: Measuring the price sensitivity of the decision to apply to college. </w:t>
+    <w:moveToRangeEnd w:id="344"/>
+    <w:p>
+      <w:pPr>
+        <w:spacing w:line="360" w:lineRule="auto"/>
+        <w:rPr>
+          <w:rFonts w:ascii="Times New Roman" w:hAnsi="Times New Roman" w:cs="Times New Roman"/>
+        </w:rPr>
+      </w:pPr>
+      <w:r>
+        <w:rPr>
+          <w:rFonts w:ascii="Times New Roman" w:hAnsi="Times New Roman" w:cs="Times New Roman"/>
+        </w:rPr>
+        <w:t xml:space="preserve">Savoca, E. (1990). Another look at the demand for higher education: Measuring the price sensitivity of the decision to apply to college. </w:t>
       </w:r>
       <w:r>
         <w:rPr>
@@ -26592,7 +26500,7 @@
       <w:pPr>
         <w:spacing w:line="360" w:lineRule="auto"/>
         <w:rPr>
-          <w:del w:id="337" w:author="Stoycho Rusinov" w:date="2026-08-08T15:23:00Z"/>
+          <w:del w:id="356" w:author="Stoycho Rusinov" w:date="2026-08-08T15:23:00Z"/>
           <w:rFonts w:ascii="Times New Roman" w:hAnsi="Times New Roman" w:cs="Times New Roman"/>
         </w:rPr>
       </w:pPr>
@@ -26630,12 +26538,12 @@
       <w:pPr>
         <w:spacing w:line="360" w:lineRule="auto"/>
         <w:rPr>
-          <w:moveFrom w:id="338" w:author="Stoycho Rusinov" w:date="2026-08-08T15:23:00Z"/>
-          <w:rFonts w:ascii="Times New Roman" w:hAnsi="Times New Roman" w:cs="Times New Roman"/>
-        </w:rPr>
-      </w:pPr>
-      <w:moveFromRangeStart w:id="339" w:author="Stoycho Rusinov" w:date="2026-08-08T15:23:00Z" w:name="move237095008"/>
-      <w:moveFrom w:id="340" w:author="Stoycho Rusinov" w:date="2026-08-08T15:23:00Z">
+          <w:moveFrom w:id="357" w:author="Stoycho Rusinov" w:date="2026-08-08T15:23:00Z"/>
+          <w:rFonts w:ascii="Times New Roman" w:hAnsi="Times New Roman" w:cs="Times New Roman"/>
+        </w:rPr>
+      </w:pPr>
+      <w:moveFromRangeStart w:id="358" w:author="Stoycho Rusinov" w:date="2026-08-08T15:23:00Z" w:name="move237095008"/>
+      <w:moveFrom w:id="359" w:author="Stoycho Rusinov" w:date="2026-08-08T15:23:00Z">
         <w:r>
           <w:rPr>
             <w:rFonts w:ascii="Times New Roman" w:hAnsi="Times New Roman" w:cs="Times New Roman"/>
@@ -26648,6 +26556,9 @@
         <w:r>
           <w:instrText xml:space="preserve"> HYPERLINK "https://assets.publishing.service.gov.uk/government/uploads/system/uploads/attachment_data/file/958998/EU_exit_estimating_the_impact_on_UK_higher_education.pdf" \h </w:instrText>
         </w:r>
+      </w:moveFrom>
+      <w:del w:id="360" w:author="Stoycho Rusinov" w:date="2026-08-08T15:23:00Z"/>
+      <w:moveFrom w:id="361" w:author="Stoycho Rusinov" w:date="2026-08-08T15:23:00Z">
         <w:r>
           <w:fldChar w:fldCharType="separate"/>
         </w:r>
@@ -26671,13 +26582,13 @@
       <w:pPr>
         <w:spacing w:line="360" w:lineRule="auto"/>
         <w:rPr>
-          <w:moveFrom w:id="341" w:author="Stoycho Rusinov" w:date="2026-08-08T15:23:00Z"/>
-          <w:rFonts w:ascii="Times New Roman" w:hAnsi="Times New Roman" w:cs="Times New Roman"/>
-        </w:rPr>
-      </w:pPr>
-      <w:moveFromRangeStart w:id="342" w:author="Stoycho Rusinov" w:date="2026-08-08T15:23:00Z" w:name="move237095009"/>
-      <w:moveFromRangeEnd w:id="339"/>
-      <w:moveFrom w:id="343" w:author="Stoycho Rusinov" w:date="2026-08-08T15:23:00Z">
+          <w:moveFrom w:id="362" w:author="Stoycho Rusinov" w:date="2026-08-08T15:23:00Z"/>
+          <w:rFonts w:ascii="Times New Roman" w:hAnsi="Times New Roman" w:cs="Times New Roman"/>
+        </w:rPr>
+      </w:pPr>
+      <w:moveFromRangeStart w:id="363" w:author="Stoycho Rusinov" w:date="2026-08-08T15:23:00Z" w:name="move237095009"/>
+      <w:moveFromRangeEnd w:id="358"/>
+      <w:moveFrom w:id="364" w:author="Stoycho Rusinov" w:date="2026-08-08T15:23:00Z">
         <w:r>
           <w:rPr>
             <w:rFonts w:ascii="Times New Roman" w:hAnsi="Times New Roman" w:cs="Times New Roman"/>
@@ -26690,6 +26601,9 @@
         <w:r>
           <w:instrText xml:space="preserve"> HYPERLINK "https://www.ecb.europa.eu/press/pr/date/2021/html/ecb.pr210708~dc78cc4b0d.en.html" \h </w:instrText>
         </w:r>
+      </w:moveFrom>
+      <w:del w:id="365" w:author="Stoycho Rusinov" w:date="2026-08-08T15:23:00Z"/>
+      <w:moveFrom w:id="366" w:author="Stoycho Rusinov" w:date="2026-08-08T15:23:00Z">
         <w:r>
           <w:fldChar w:fldCharType="separate"/>
         </w:r>
@@ -26713,13 +26627,13 @@
       <w:pPr>
         <w:spacing w:line="360" w:lineRule="auto"/>
         <w:rPr>
-          <w:moveFrom w:id="344" w:author="Stoycho Rusinov" w:date="2026-08-08T15:23:00Z"/>
-          <w:rFonts w:ascii="Times New Roman" w:hAnsi="Times New Roman" w:cs="Times New Roman"/>
-        </w:rPr>
-      </w:pPr>
-      <w:moveFromRangeStart w:id="345" w:author="Stoycho Rusinov" w:date="2026-08-08T15:23:00Z" w:name="move237095011"/>
-      <w:moveFromRangeEnd w:id="342"/>
-      <w:moveFrom w:id="346" w:author="Stoycho Rusinov" w:date="2026-08-08T15:23:00Z">
+          <w:moveFrom w:id="367" w:author="Stoycho Rusinov" w:date="2026-08-08T15:23:00Z"/>
+          <w:rFonts w:ascii="Times New Roman" w:hAnsi="Times New Roman" w:cs="Times New Roman"/>
+        </w:rPr>
+      </w:pPr>
+      <w:moveFromRangeStart w:id="368" w:author="Stoycho Rusinov" w:date="2026-08-08T15:23:00Z" w:name="move237095011"/>
+      <w:moveFromRangeEnd w:id="363"/>
+      <w:moveFrom w:id="369" w:author="Stoycho Rusinov" w:date="2026-08-08T15:23:00Z">
         <w:r>
           <w:rPr>
             <w:rFonts w:ascii="Times New Roman" w:hAnsi="Times New Roman" w:cs="Times New Roman"/>
@@ -26732,6 +26646,9 @@
         <w:r>
           <w:instrText xml:space="preserve"> HYPERLINK "https://www.publicfirst.co.uk/couting-the-cost" \h </w:instrText>
         </w:r>
+      </w:moveFrom>
+      <w:del w:id="370" w:author="Stoycho Rusinov" w:date="2026-08-08T15:23:00Z"/>
+      <w:moveFrom w:id="371" w:author="Stoycho Rusinov" w:date="2026-08-08T15:23:00Z">
         <w:r>
           <w:fldChar w:fldCharType="separate"/>
         </w:r>
@@ -26755,13 +26672,13 @@
       <w:pPr>
         <w:spacing w:line="360" w:lineRule="auto"/>
         <w:rPr>
-          <w:moveFrom w:id="347" w:author="Stoycho Rusinov" w:date="2026-08-08T15:23:00Z"/>
-          <w:rFonts w:ascii="Times New Roman" w:hAnsi="Times New Roman" w:cs="Times New Roman"/>
-        </w:rPr>
-      </w:pPr>
-      <w:moveFromRangeStart w:id="348" w:author="Stoycho Rusinov" w:date="2026-08-08T15:23:00Z" w:name="move237095012"/>
-      <w:moveFromRangeEnd w:id="345"/>
-      <w:moveFrom w:id="349" w:author="Stoycho Rusinov" w:date="2026-08-08T15:23:00Z">
+          <w:moveFrom w:id="372" w:author="Stoycho Rusinov" w:date="2026-08-08T15:23:00Z"/>
+          <w:rFonts w:ascii="Times New Roman" w:hAnsi="Times New Roman" w:cs="Times New Roman"/>
+        </w:rPr>
+      </w:pPr>
+      <w:moveFromRangeStart w:id="373" w:author="Stoycho Rusinov" w:date="2026-08-08T15:23:00Z" w:name="move237095012"/>
+      <w:moveFromRangeEnd w:id="368"/>
+      <w:moveFrom w:id="374" w:author="Stoycho Rusinov" w:date="2026-08-08T15:23:00Z">
         <w:r>
           <w:rPr>
             <w:rFonts w:ascii="Times New Roman" w:hAnsi="Times New Roman" w:cs="Times New Roman"/>
@@ -26774,6 +26691,9 @@
         <w:r>
           <w:instrText xml:space="preserve"> HYPERLINK "https://doi.org/10.2139/ssrn.2481553" \h </w:instrText>
         </w:r>
+      </w:moveFrom>
+      <w:del w:id="375" w:author="Stoycho Rusinov" w:date="2026-08-08T15:23:00Z"/>
+      <w:moveFrom w:id="376" w:author="Stoycho Rusinov" w:date="2026-08-08T15:23:00Z">
         <w:r>
           <w:fldChar w:fldCharType="separate"/>
         </w:r>
@@ -26797,11 +26717,11 @@
       <w:pPr>
         <w:spacing w:line="360" w:lineRule="auto"/>
         <w:rPr>
-          <w:moveFrom w:id="350" w:author="Stoycho Rusinov" w:date="2026-08-08T15:23:00Z"/>
-          <w:rFonts w:ascii="Times New Roman" w:hAnsi="Times New Roman" w:cs="Times New Roman"/>
-        </w:rPr>
-      </w:pPr>
-      <w:moveFrom w:id="351" w:author="Stoycho Rusinov" w:date="2026-08-08T15:23:00Z">
+          <w:moveFrom w:id="377" w:author="Stoycho Rusinov" w:date="2026-08-08T15:23:00Z"/>
+          <w:rFonts w:ascii="Times New Roman" w:hAnsi="Times New Roman" w:cs="Times New Roman"/>
+        </w:rPr>
+      </w:pPr>
+      <w:moveFrom w:id="378" w:author="Stoycho Rusinov" w:date="2026-08-08T15:23:00Z">
         <w:r>
           <w:rPr>
             <w:rFonts w:ascii="Times New Roman" w:hAnsi="Times New Roman" w:cs="Times New Roman"/>
@@ -26814,6 +26734,9 @@
         <w:r>
           <w:instrText xml:space="preserve"> HYPERLINK "https://kclpure.kcl.ac.uk/ws/files/97277490/The_E_ect_of_University_Fees_SA_Accepted13July2017_GREEN_AAM.pdf" \h </w:instrText>
         </w:r>
+      </w:moveFrom>
+      <w:del w:id="379" w:author="Stoycho Rusinov" w:date="2026-08-08T15:23:00Z"/>
+      <w:moveFrom w:id="380" w:author="Stoycho Rusinov" w:date="2026-08-08T15:23:00Z">
         <w:r>
           <w:fldChar w:fldCharType="separate"/>
         </w:r>
@@ -26837,11 +26760,11 @@
       <w:pPr>
         <w:spacing w:line="360" w:lineRule="auto"/>
         <w:rPr>
-          <w:moveFrom w:id="352" w:author="Stoycho Rusinov" w:date="2026-08-08T15:23:00Z"/>
-          <w:rFonts w:ascii="Times New Roman" w:hAnsi="Times New Roman" w:cs="Times New Roman"/>
-        </w:rPr>
-      </w:pPr>
-      <w:moveFrom w:id="353" w:author="Stoycho Rusinov" w:date="2026-08-08T15:23:00Z">
+          <w:moveFrom w:id="381" w:author="Stoycho Rusinov" w:date="2026-08-08T15:23:00Z"/>
+          <w:rFonts w:ascii="Times New Roman" w:hAnsi="Times New Roman" w:cs="Times New Roman"/>
+        </w:rPr>
+      </w:pPr>
+      <w:moveFrom w:id="382" w:author="Stoycho Rusinov" w:date="2026-08-08T15:23:00Z">
         <w:r>
           <w:rPr>
             <w:rFonts w:ascii="Times New Roman" w:hAnsi="Times New Roman" w:cs="Times New Roman"/>
@@ -26854,6 +26777,9 @@
         <w:r>
           <w:instrText xml:space="preserve"> HYPERLINK "https://doi.org/10.1111/ecca.12278" \h </w:instrText>
         </w:r>
+      </w:moveFrom>
+      <w:del w:id="383" w:author="Stoycho Rusinov" w:date="2026-08-08T15:23:00Z"/>
+      <w:moveFrom w:id="384" w:author="Stoycho Rusinov" w:date="2026-08-08T15:23:00Z">
         <w:r>
           <w:fldChar w:fldCharType="separate"/>
         </w:r>
@@ -26880,9 +26806,9 @@
           <w:rFonts w:ascii="Times New Roman" w:hAnsi="Times New Roman" w:cs="Times New Roman"/>
         </w:rPr>
       </w:pPr>
-      <w:moveFromRangeStart w:id="354" w:author="Stoycho Rusinov" w:date="2026-08-08T15:23:00Z" w:name="move237095010"/>
-      <w:moveFromRangeEnd w:id="348"/>
-      <w:moveFrom w:id="355" w:author="Stoycho Rusinov" w:date="2026-08-08T15:23:00Z">
+      <w:moveFromRangeStart w:id="385" w:author="Stoycho Rusinov" w:date="2026-08-08T15:23:00Z" w:name="move237095010"/>
+      <w:moveFromRangeEnd w:id="373"/>
+      <w:moveFrom w:id="386" w:author="Stoycho Rusinov" w:date="2026-08-08T15:23:00Z">
         <w:r>
           <w:rPr>
             <w:rFonts w:ascii="Times New Roman" w:hAnsi="Times New Roman" w:cs="Times New Roman"/>
@@ -26895,6 +26821,9 @@
         <w:r>
           <w:instrText xml:space="preserve"> HYPERLINK "https://www.gov.uk/government/news/graduate-route-for-best-and-brightest-launches" \h </w:instrText>
         </w:r>
+      </w:moveFrom>
+      <w:del w:id="387" w:author="Stoycho Rusinov" w:date="2026-08-08T15:23:00Z"/>
+      <w:moveFrom w:id="388" w:author="Stoycho Rusinov" w:date="2026-08-08T15:23:00Z">
         <w:r>
           <w:fldChar w:fldCharType="separate"/>
         </w:r>
@@ -26913,7 +26842,7 @@
           <w:fldChar w:fldCharType="end"/>
         </w:r>
       </w:moveFrom>
-      <w:moveFromRangeEnd w:id="354"/>
+      <w:moveFromRangeEnd w:id="385"/>
     </w:p>
     <w:sectPr>
       <w:headerReference w:type="default" r:id="rId51"/>
@@ -26928,7 +26857,7 @@
 </file>
 
 <file path=word/endnotes.xml><?xml version="1.0" encoding="utf-8"?>
-<w:endnotes xmlns:wpc="http://schemas.microsoft.com/office/word/2010/wordprocessingCanvas" xmlns:cx="http://schemas.microsoft.com/office/drawing/2014/chartex" xmlns:cx1="http://schemas.microsoft.com/office/drawing/2015/9/8/chartex" xmlns:cx2="http://schemas.microsoft.com/office/drawing/2015/10/21/chartex" xmlns:cx3="http://schemas.microsoft.com/office/drawing/2016/5/9/chartex" xmlns:cx4="http://schemas.microsoft.com/office/drawing/2016/5/10/chartex" xmlns:cx5="http://schemas.microsoft.com/office/drawing/2016/5/11/chartex" xmlns:cx6="http://schemas.microsoft.com/office/drawing/2016/5/12/chartex" xmlns:cx7="http://schemas.microsoft.com/office/drawing/2016/5/13/chartex" xmlns:cx8="http://schemas.microsoft.com/office/drawing/2016/5/14/chartex" xmlns:mc="http://schemas.openxmlformats.org/markup-compatibility/2006" xmlns:aink="http://schemas.microsoft.com/office/drawing/2016/ink" xmlns:am3d="http://schemas.microsoft.com/office/drawing/2017/model3d" xmlns:o="urn:schemas-microsoft-com:office:office" xmlns:r="http://schemas.openxmlformats.org/officeDocument/2006/relationships" xmlns:m="http://schemas.openxmlformats.org/officeDocument/2006/math" xmlns:v="urn:schemas-microsoft-com:vml" xmlns:wp14="http://schemas.microsoft.com/office/word/2010/wordprocessingDrawing" xmlns:wp="http://schemas.openxmlformats.org/drawingml/2006/wordprocessingDrawing" xmlns:w10="urn:schemas-microsoft-com:office:word" xmlns:w="http://schemas.openxmlformats.org/wordprocessingml/2006/main" xmlns:w14="http://schemas.microsoft.com/office/word/2010/wordml" xmlns:w15="http://schemas.microsoft.com/office/word/2012/wordml" xmlns:w16cid="http://schemas.microsoft.com/office/word/2016/wordml/cid" xmlns:w16se="http://schemas.microsoft.com/office/word/2015/wordml/symex" xmlns:wpg="http://schemas.microsoft.com/office/word/2010/wordprocessingGroup" xmlns:wpi="http://schemas.microsoft.com/office/word/2010/wordprocessingInk" xmlns:wne="http://schemas.microsoft.com/office/word/2006/wordml" xmlns:wps="http://schemas.microsoft.com/office/word/2010/wordprocessingShape" mc:Ignorable="w14 w15 w16se w16cid wp14">
+<w:endnotes xmlns:wpc="http://schemas.microsoft.com/office/word/2010/wordprocessingCanvas" xmlns:cx="http://schemas.microsoft.com/office/drawing/2014/chartex" xmlns:cx1="http://schemas.microsoft.com/office/drawing/2015/9/8/chartex" xmlns:cx2="http://schemas.microsoft.com/office/drawing/2015/10/21/chartex" xmlns:cx3="http://schemas.microsoft.com/office/drawing/2016/5/9/chartex" xmlns:cx4="http://schemas.microsoft.com/office/drawing/2016/5/10/chartex" xmlns:cx5="http://schemas.microsoft.com/office/drawing/2016/5/11/chartex" xmlns:cx6="http://schemas.microsoft.com/office/drawing/2016/5/12/chartex" xmlns:cx7="http://schemas.microsoft.com/office/drawing/2016/5/13/chartex" xmlns:cx8="http://schemas.microsoft.com/office/drawing/2016/5/14/chartex" xmlns:mc="http://schemas.openxmlformats.org/markup-compatibility/2006" xmlns:aink="http://schemas.microsoft.com/office/drawing/2016/ink" xmlns:am3d="http://schemas.microsoft.com/office/drawing/2017/model3d" xmlns:o="urn:schemas-microsoft-com:office:office" xmlns:oel="http://schemas.microsoft.com/office/2019/extlst" xmlns:r="http://schemas.openxmlformats.org/officeDocument/2006/relationships" xmlns:m="http://schemas.openxmlformats.org/officeDocument/2006/math" xmlns:v="urn:schemas-microsoft-com:vml" xmlns:wp14="http://schemas.microsoft.com/office/word/2010/wordprocessingDrawing" xmlns:wp="http://schemas.openxmlformats.org/drawingml/2006/wordprocessingDrawing" xmlns:w10="urn:schemas-microsoft-com:office:word" xmlns:w="http://schemas.openxmlformats.org/wordprocessingml/2006/main" xmlns:w14="http://schemas.microsoft.com/office/word/2010/wordml" xmlns:w15="http://schemas.microsoft.com/office/word/2012/wordml" xmlns:w16cex="http://schemas.microsoft.com/office/word/2018/wordml/cex" xmlns:w16cid="http://schemas.microsoft.com/office/word/2016/wordml/cid" xmlns:w16="http://schemas.microsoft.com/office/word/2018/wordml" xmlns:w16du="http://schemas.microsoft.com/office/word/2023/wordml/word16du" xmlns:w16sdtdh="http://schemas.microsoft.com/office/word/2020/wordml/sdtdatahash" xmlns:w16sdtfl="http://schemas.microsoft.com/office/word/2024/wordml/sdtformatlock" xmlns:w16se="http://schemas.microsoft.com/office/word/2015/wordml/symex" xmlns:wpg="http://schemas.microsoft.com/office/word/2010/wordprocessingGroup" xmlns:wpi="http://schemas.microsoft.com/office/word/2010/wordprocessingInk" xmlns:wne="http://schemas.microsoft.com/office/word/2006/wordml" xmlns:wps="http://schemas.microsoft.com/office/word/2010/wordprocessingShape" mc:Ignorable="w14 w15 w16se w16cid w16 w16cex w16sdtdh w16sdtfl w16du wp14">
   <w:endnote w:type="separator" w:id="-1">
     <w:p>
       <w:r>
@@ -26950,7 +26879,7 @@
 </file>
 
 <file path=word/footer1.xml><?xml version="1.0" encoding="utf-8"?>
-<w:ftr xmlns:wpc="http://schemas.microsoft.com/office/word/2010/wordprocessingCanvas" xmlns:cx="http://schemas.microsoft.com/office/drawing/2014/chartex" xmlns:cx1="http://schemas.microsoft.com/office/drawing/2015/9/8/chartex" xmlns:cx2="http://schemas.microsoft.com/office/drawing/2015/10/21/chartex" xmlns:cx3="http://schemas.microsoft.com/office/drawing/2016/5/9/chartex" xmlns:cx4="http://schemas.microsoft.com/office/drawing/2016/5/10/chartex" xmlns:cx5="http://schemas.microsoft.com/office/drawing/2016/5/11/chartex" xmlns:cx6="http://schemas.microsoft.com/office/drawing/2016/5/12/chartex" xmlns:cx7="http://schemas.microsoft.com/office/drawing/2016/5/13/chartex" xmlns:cx8="http://schemas.microsoft.com/office/drawing/2016/5/14/chartex" xmlns:mc="http://schemas.openxmlformats.org/markup-compatibility/2006" xmlns:aink="http://schemas.microsoft.com/office/drawing/2016/ink" xmlns:am3d="http://schemas.microsoft.com/office/drawing/2017/model3d" xmlns:o="urn:schemas-microsoft-com:office:office" xmlns:r="http://schemas.openxmlformats.org/officeDocument/2006/relationships" xmlns:m="http://schemas.openxmlformats.org/officeDocument/2006/math" xmlns:v="urn:schemas-microsoft-com:vml" xmlns:wp14="http://schemas.microsoft.com/office/word/2010/wordprocessingDrawing" xmlns:wp="http://schemas.openxmlformats.org/drawingml/2006/wordprocessingDrawing" xmlns:w10="urn:schemas-microsoft-com:office:word" xmlns:w="http://schemas.openxmlformats.org/wordprocessingml/2006/main" xmlns:w14="http://schemas.microsoft.com/office/word/2010/wordml" xmlns:w15="http://schemas.microsoft.com/office/word/2012/wordml" xmlns:w16cid="http://schemas.microsoft.com/office/word/2016/wordml/cid" xmlns:w16se="http://schemas.microsoft.com/office/word/2015/wordml/symex" xmlns:wpg="http://schemas.microsoft.com/office/word/2010/wordprocessingGroup" xmlns:wpi="http://schemas.microsoft.com/office/word/2010/wordprocessingInk" xmlns:wne="http://schemas.microsoft.com/office/word/2006/wordml" xmlns:wps="http://schemas.microsoft.com/office/word/2010/wordprocessingShape" mc:Ignorable="w14 w15 w16se w16cid wp14">
+<w:ftr xmlns:wpc="http://schemas.microsoft.com/office/word/2010/wordprocessingCanvas" xmlns:cx="http://schemas.microsoft.com/office/drawing/2014/chartex" xmlns:cx1="http://schemas.microsoft.com/office/drawing/2015/9/8/chartex" xmlns:cx2="http://schemas.microsoft.com/office/drawing/2015/10/21/chartex" xmlns:cx3="http://schemas.microsoft.com/office/drawing/2016/5/9/chartex" xmlns:cx4="http://schemas.microsoft.com/office/drawing/2016/5/10/chartex" xmlns:cx5="http://schemas.microsoft.com/office/drawing/2016/5/11/chartex" xmlns:cx6="http://schemas.microsoft.com/office/drawing/2016/5/12/chartex" xmlns:cx7="http://schemas.microsoft.com/office/drawing/2016/5/13/chartex" xmlns:cx8="http://schemas.microsoft.com/office/drawing/2016/5/14/chartex" xmlns:mc="http://schemas.openxmlformats.org/markup-compatibility/2006" xmlns:aink="http://schemas.microsoft.com/office/drawing/2016/ink" xmlns:am3d="http://schemas.microsoft.com/office/drawing/2017/model3d" xmlns:o="urn:schemas-microsoft-com:office:office" xmlns:oel="http://schemas.microsoft.com/office/2019/extlst" xmlns:r="http://schemas.openxmlformats.org/officeDocument/2006/relationships" xmlns:m="http://schemas.openxmlformats.org/officeDocument/2006/math" xmlns:v="urn:schemas-microsoft-com:vml" xmlns:wp14="http://schemas.microsoft.com/office/word/2010/wordprocessingDrawing" xmlns:wp="http://schemas.openxmlformats.org/drawingml/2006/wordprocessingDrawing" xmlns:w10="urn:schemas-microsoft-com:office:word" xmlns:w="http://schemas.openxmlformats.org/wordprocessingml/2006/main" xmlns:w14="http://schemas.microsoft.com/office/word/2010/wordml" xmlns:w15="http://schemas.microsoft.com/office/word/2012/wordml" xmlns:w16cex="http://schemas.microsoft.com/office/word/2018/wordml/cex" xmlns:w16cid="http://schemas.microsoft.com/office/word/2016/wordml/cid" xmlns:w16="http://schemas.microsoft.com/office/word/2018/wordml" xmlns:w16du="http://schemas.microsoft.com/office/word/2023/wordml/word16du" xmlns:w16sdtdh="http://schemas.microsoft.com/office/word/2020/wordml/sdtdatahash" xmlns:w16sdtfl="http://schemas.microsoft.com/office/word/2024/wordml/sdtformatlock" xmlns:w16se="http://schemas.microsoft.com/office/word/2015/wordml/symex" xmlns:wpg="http://schemas.microsoft.com/office/word/2010/wordprocessingGroup" xmlns:wpi="http://schemas.microsoft.com/office/word/2010/wordprocessingInk" xmlns:wne="http://schemas.microsoft.com/office/word/2006/wordml" xmlns:wps="http://schemas.microsoft.com/office/word/2010/wordprocessingShape" mc:Ignorable="w14 w15 w16se w16cid w16 w16cex w16sdtdh w16sdtfl w16du wp14">
   <w:p>
     <w:pPr>
       <w:pStyle w:val="Footer"/>
@@ -26960,7 +26889,7 @@
 </file>
 
 <file path=word/footnotes.xml><?xml version="1.0" encoding="utf-8"?>
-<w:footnotes xmlns:wpc="http://schemas.microsoft.com/office/word/2010/wordprocessingCanvas" xmlns:cx="http://schemas.microsoft.com/office/drawing/2014/chartex" xmlns:cx1="http://schemas.microsoft.com/office/drawing/2015/9/8/chartex" xmlns:cx2="http://schemas.microsoft.com/office/drawing/2015/10/21/chartex" xmlns:cx3="http://schemas.microsoft.com/office/drawing/2016/5/9/chartex" xmlns:cx4="http://schemas.microsoft.com/office/drawing/2016/5/10/chartex" xmlns:cx5="http://schemas.microsoft.com/office/drawing/2016/5/11/chartex" xmlns:cx6="http://schemas.microsoft.com/office/drawing/2016/5/12/chartex" xmlns:cx7="http://schemas.microsoft.com/office/drawing/2016/5/13/chartex" xmlns:cx8="http://schemas.microsoft.com/office/drawing/2016/5/14/chartex" xmlns:mc="http://schemas.openxmlformats.org/markup-compatibility/2006" xmlns:aink="http://schemas.microsoft.com/office/drawing/2016/ink" xmlns:am3d="http://schemas.microsoft.com/office/drawing/2017/model3d" xmlns:o="urn:schemas-microsoft-com:office:office" xmlns:r="http://schemas.openxmlformats.org/officeDocument/2006/relationships" xmlns:m="http://schemas.openxmlformats.org/officeDocument/2006/math" xmlns:v="urn:schemas-microsoft-com:vml" xmlns:wp14="http://schemas.microsoft.com/office/word/2010/wordprocessingDrawing" xmlns:wp="http://schemas.openxmlformats.org/drawingml/2006/wordprocessingDrawing" xmlns:w10="urn:schemas-microsoft-com:office:word" xmlns:w="http://schemas.openxmlformats.org/wordprocessingml/2006/main" xmlns:w14="http://schemas.microsoft.com/office/word/2010/wordml" xmlns:w15="http://schemas.microsoft.com/office/word/2012/wordml" xmlns:w16cid="http://schemas.microsoft.com/office/word/2016/wordml/cid" xmlns:w16se="http://schemas.microsoft.com/office/word/2015/wordml/symex" xmlns:wpg="http://schemas.microsoft.com/office/word/2010/wordprocessingGroup" xmlns:wpi="http://schemas.microsoft.com/office/word/2010/wordprocessingInk" xmlns:wne="http://schemas.microsoft.com/office/word/2006/wordml" xmlns:wps="http://schemas.microsoft.com/office/word/2010/wordprocessingShape" mc:Ignorable="w14 w15 w16se w16cid wp14">
+<w:footnotes xmlns:wpc="http://schemas.microsoft.com/office/word/2010/wordprocessingCanvas" xmlns:cx="http://schemas.microsoft.com/office/drawing/2014/chartex" xmlns:cx1="http://schemas.microsoft.com/office/drawing/2015/9/8/chartex" xmlns:cx2="http://schemas.microsoft.com/office/drawing/2015/10/21/chartex" xmlns:cx3="http://schemas.microsoft.com/office/drawing/2016/5/9/chartex" xmlns:cx4="http://schemas.microsoft.com/office/drawing/2016/5/10/chartex" xmlns:cx5="http://schemas.microsoft.com/office/drawing/2016/5/11/chartex" xmlns:cx6="http://schemas.microsoft.com/office/drawing/2016/5/12/chartex" xmlns:cx7="http://schemas.microsoft.com/office/drawing/2016/5/13/chartex" xmlns:cx8="http://schemas.microsoft.com/office/drawing/2016/5/14/chartex" xmlns:mc="http://schemas.openxmlformats.org/markup-compatibility/2006" xmlns:aink="http://schemas.microsoft.com/office/drawing/2016/ink" xmlns:am3d="http://schemas.microsoft.com/office/drawing/2017/model3d" xmlns:o="urn:schemas-microsoft-com:office:office" xmlns:oel="http://schemas.microsoft.com/office/2019/extlst" xmlns:r="http://schemas.openxmlformats.org/officeDocument/2006/relationships" xmlns:m="http://schemas.openxmlformats.org/officeDocument/2006/math" xmlns:v="urn:schemas-microsoft-com:vml" xmlns:wp14="http://schemas.microsoft.com/office/word/2010/wordprocessingDrawing" xmlns:wp="http://schemas.openxmlformats.org/drawingml/2006/wordprocessingDrawing" xmlns:w10="urn:schemas-microsoft-com:office:word" xmlns:w="http://schemas.openxmlformats.org/wordprocessingml/2006/main" xmlns:w14="http://schemas.microsoft.com/office/word/2010/wordml" xmlns:w15="http://schemas.microsoft.com/office/word/2012/wordml" xmlns:w16cex="http://schemas.microsoft.com/office/word/2018/wordml/cex" xmlns:w16cid="http://schemas.microsoft.com/office/word/2016/wordml/cid" xmlns:w16="http://schemas.microsoft.com/office/word/2018/wordml" xmlns:w16du="http://schemas.microsoft.com/office/word/2023/wordml/word16du" xmlns:w16sdtdh="http://schemas.microsoft.com/office/word/2020/wordml/sdtdatahash" xmlns:w16sdtfl="http://schemas.microsoft.com/office/word/2024/wordml/sdtformatlock" xmlns:w16se="http://schemas.microsoft.com/office/word/2015/wordml/symex" xmlns:wpg="http://schemas.microsoft.com/office/word/2010/wordprocessingGroup" xmlns:wpi="http://schemas.microsoft.com/office/word/2010/wordprocessingInk" xmlns:wne="http://schemas.microsoft.com/office/word/2006/wordml" xmlns:wps="http://schemas.microsoft.com/office/word/2010/wordprocessingShape" mc:Ignorable="w14 w15 w16se w16cid w16 w16cex w16sdtdh w16sdtfl w16du wp14">
   <w:footnote w:type="separator" w:id="-1">
     <w:p>
       <w:r>
@@ -27330,7 +27259,7 @@
 </file>
 
 <file path=word/header1.xml><?xml version="1.0" encoding="utf-8"?>
-<w:hdr xmlns:wpc="http://schemas.microsoft.com/office/word/2010/wordprocessingCanvas" xmlns:cx="http://schemas.microsoft.com/office/drawing/2014/chartex" xmlns:cx1="http://schemas.microsoft.com/office/drawing/2015/9/8/chartex" xmlns:cx2="http://schemas.microsoft.com/office/drawing/2015/10/21/chartex" xmlns:cx3="http://schemas.microsoft.com/office/drawing/2016/5/9/chartex" xmlns:cx4="http://schemas.microsoft.com/office/drawing/2016/5/10/chartex" xmlns:cx5="http://schemas.microsoft.com/office/drawing/2016/5/11/chartex" xmlns:cx6="http://schemas.microsoft.com/office/drawing/2016/5/12/chartex" xmlns:cx7="http://schemas.microsoft.com/office/drawing/2016/5/13/chartex" xmlns:cx8="http://schemas.microsoft.com/office/drawing/2016/5/14/chartex" xmlns:mc="http://schemas.openxmlformats.org/markup-compatibility/2006" xmlns:aink="http://schemas.microsoft.com/office/drawing/2016/ink" xmlns:am3d="http://schemas.microsoft.com/office/drawing/2017/model3d" xmlns:o="urn:schemas-microsoft-com:office:office" xmlns:r="http://schemas.openxmlformats.org/officeDocument/2006/relationships" xmlns:m="http://schemas.openxmlformats.org/officeDocument/2006/math" xmlns:v="urn:schemas-microsoft-com:vml" xmlns:wp14="http://schemas.microsoft.com/office/word/2010/wordprocessingDrawing" xmlns:wp="http://schemas.openxmlformats.org/drawingml/2006/wordprocessingDrawing" xmlns:w10="urn:schemas-microsoft-com:office:word" xmlns:w="http://schemas.openxmlformats.org/wordprocessingml/2006/main" xmlns:w14="http://schemas.microsoft.com/office/word/2010/wordml" xmlns:w15="http://schemas.microsoft.com/office/word/2012/wordml" xmlns:w16cid="http://schemas.microsoft.com/office/word/2016/wordml/cid" xmlns:w16se="http://schemas.microsoft.com/office/word/2015/wordml/symex" xmlns:wpg="http://schemas.microsoft.com/office/word/2010/wordprocessingGroup" xmlns:wpi="http://schemas.microsoft.com/office/word/2010/wordprocessingInk" xmlns:wne="http://schemas.microsoft.com/office/word/2006/wordml" xmlns:wps="http://schemas.microsoft.com/office/word/2010/wordprocessingShape" mc:Ignorable="w14 w15 w16se w16cid wp14">
+<w:hdr xmlns:wpc="http://schemas.microsoft.com/office/word/2010/wordprocessingCanvas" xmlns:cx="http://schemas.microsoft.com/office/drawing/2014/chartex" xmlns:cx1="http://schemas.microsoft.com/office/drawing/2015/9/8/chartex" xmlns:cx2="http://schemas.microsoft.com/office/drawing/2015/10/21/chartex" xmlns:cx3="http://schemas.microsoft.com/office/drawing/2016/5/9/chartex" xmlns:cx4="http://schemas.microsoft.com/office/drawing/2016/5/10/chartex" xmlns:cx5="http://schemas.microsoft.com/office/drawing/2016/5/11/chartex" xmlns:cx6="http://schemas.microsoft.com/office/drawing/2016/5/12/chartex" xmlns:cx7="http://schemas.microsoft.com/office/drawing/2016/5/13/chartex" xmlns:cx8="http://schemas.microsoft.com/office/drawing/2016/5/14/chartex" xmlns:mc="http://schemas.openxmlformats.org/markup-compatibility/2006" xmlns:aink="http://schemas.microsoft.com/office/drawing/2016/ink" xmlns:am3d="http://schemas.microsoft.com/office/drawing/2017/model3d" xmlns:o="urn:schemas-microsoft-com:office:office" xmlns:oel="http://schemas.microsoft.com/office/2019/extlst" xmlns:r="http://schemas.openxmlformats.org/officeDocument/2006/relationships" xmlns:m="http://schemas.openxmlformats.org/officeDocument/2006/math" xmlns:v="urn:schemas-microsoft-com:vml" xmlns:wp14="http://schemas.microsoft.com/office/word/2010/wordprocessingDrawing" xmlns:wp="http://schemas.openxmlformats.org/drawingml/2006/wordprocessingDrawing" xmlns:w10="urn:schemas-microsoft-com:office:word" xmlns:w="http://schemas.openxmlformats.org/wordprocessingml/2006/main" xmlns:w14="http://schemas.microsoft.com/office/word/2010/wordml" xmlns:w15="http://schemas.microsoft.com/office/word/2012/wordml" xmlns:w16cex="http://schemas.microsoft.com/office/word/2018/wordml/cex" xmlns:w16cid="http://schemas.microsoft.com/office/word/2016/wordml/cid" xmlns:w16="http://schemas.microsoft.com/office/word/2018/wordml" xmlns:w16du="http://schemas.microsoft.com/office/word/2023/wordml/word16du" xmlns:w16sdtdh="http://schemas.microsoft.com/office/word/2020/wordml/sdtdatahash" xmlns:w16sdtfl="http://schemas.microsoft.com/office/word/2024/wordml/sdtformatlock" xmlns:w16se="http://schemas.microsoft.com/office/word/2015/wordml/symex" xmlns:wpg="http://schemas.microsoft.com/office/word/2010/wordprocessingGroup" xmlns:wpi="http://schemas.microsoft.com/office/word/2010/wordprocessingInk" xmlns:wne="http://schemas.microsoft.com/office/word/2006/wordml" xmlns:wps="http://schemas.microsoft.com/office/word/2010/wordprocessingShape" mc:Ignorable="w14 w15 w16se w16cid w16 w16cex w16sdtdh w16sdtfl w16du wp14">
   <w:p>
     <w:pPr>
       <w:pStyle w:val="Header"/>
@@ -27340,7 +27269,7 @@
 </file>
 
 <file path=word/numbering.xml><?xml version="1.0" encoding="utf-8"?>
-<w:numbering xmlns:wpc="http://schemas.microsoft.com/office/word/2010/wordprocessingCanvas" xmlns:cx="http://schemas.microsoft.com/office/drawing/2014/chartex" xmlns:cx1="http://schemas.microsoft.com/office/drawing/2015/9/8/chartex" xmlns:cx2="http://schemas.microsoft.com/office/drawing/2015/10/21/chartex" xmlns:cx3="http://schemas.microsoft.com/office/drawing/2016/5/9/chartex" xmlns:cx4="http://schemas.microsoft.com/office/drawing/2016/5/10/chartex" xmlns:cx5="http://schemas.microsoft.com/office/drawing/2016/5/11/chartex" xmlns:cx6="http://schemas.microsoft.com/office/drawing/2016/5/12/chartex" xmlns:cx7="http://schemas.microsoft.com/office/drawing/2016/5/13/chartex" xmlns:cx8="http://schemas.microsoft.com/office/drawing/2016/5/14/chartex" xmlns:mc="http://schemas.openxmlformats.org/markup-compatibility/2006" xmlns:aink="http://schemas.microsoft.com/office/drawing/2016/ink" xmlns:am3d="http://schemas.microsoft.com/office/drawing/2017/model3d" xmlns:o="urn:schemas-microsoft-com:office:office" xmlns:r="http://schemas.openxmlformats.org/officeDocument/2006/relationships" xmlns:m="http://schemas.openxmlformats.org/officeDocument/2006/math" xmlns:v="urn:schemas-microsoft-com:vml" xmlns:wp14="http://schemas.microsoft.com/office/word/2010/wordprocessingDrawing" xmlns:wp="http://schemas.openxmlformats.org/drawingml/2006/wordprocessingDrawing" xmlns:w10="urn:schemas-microsoft-com:office:word" xmlns:w="http://schemas.openxmlformats.org/wordprocessingml/2006/main" xmlns:w14="http://schemas.microsoft.com/office/word/2010/wordml" xmlns:w15="http://schemas.microsoft.com/office/word/2012/wordml" xmlns:w16cid="http://schemas.microsoft.com/office/word/2016/wordml/cid" xmlns:w16se="http://schemas.microsoft.com/office/word/2015/wordml/symex" xmlns:wpg="http://schemas.microsoft.com/office/word/2010/wordprocessingGroup" xmlns:wpi="http://schemas.microsoft.com/office/word/2010/wordprocessingInk" xmlns:wne="http://schemas.microsoft.com/office/word/2006/wordml" xmlns:wps="http://schemas.microsoft.com/office/word/2010/wordprocessingShape" mc:Ignorable="w14 w15 w16se w16cid wp14">
+<w:numbering xmlns:wpc="http://schemas.microsoft.com/office/word/2010/wordprocessingCanvas" xmlns:cx="http://schemas.microsoft.com/office/drawing/2014/chartex" xmlns:cx1="http://schemas.microsoft.com/office/drawing/2015/9/8/chartex" xmlns:cx2="http://schemas.microsoft.com/office/drawing/2015/10/21/chartex" xmlns:cx3="http://schemas.microsoft.com/office/drawing/2016/5/9/chartex" xmlns:cx4="http://schemas.microsoft.com/office/drawing/2016/5/10/chartex" xmlns:cx5="http://schemas.microsoft.com/office/drawing/2016/5/11/chartex" xmlns:cx6="http://schemas.microsoft.com/office/drawing/2016/5/12/chartex" xmlns:cx7="http://schemas.microsoft.com/office/drawing/2016/5/13/chartex" xmlns:cx8="http://schemas.microsoft.com/office/drawing/2016/5/14/chartex" xmlns:mc="http://schemas.openxmlformats.org/markup-compatibility/2006" xmlns:aink="http://schemas.microsoft.com/office/drawing/2016/ink" xmlns:am3d="http://schemas.microsoft.com/office/drawing/2017/model3d" xmlns:o="urn:schemas-microsoft-com:office:office" xmlns:oel="http://schemas.microsoft.com/office/2019/extlst" xmlns:r="http://schemas.openxmlformats.org/officeDocument/2006/relationships" xmlns:m="http://schemas.openxmlformats.org/officeDocument/2006/math" xmlns:v="urn:schemas-microsoft-com:vml" xmlns:wp14="http://schemas.microsoft.com/office/word/2010/wordprocessingDrawing" xmlns:wp="http://schemas.openxmlformats.org/drawingml/2006/wordprocessingDrawing" xmlns:w10="urn:schemas-microsoft-com:office:word" xmlns:w="http://schemas.openxmlformats.org/wordprocessingml/2006/main" xmlns:w14="http://schemas.microsoft.com/office/word/2010/wordml" xmlns:w15="http://schemas.microsoft.com/office/word/2012/wordml" xmlns:w16cex="http://schemas.microsoft.com/office/word/2018/wordml/cex" xmlns:w16cid="http://schemas.microsoft.com/office/word/2016/wordml/cid" xmlns:w16="http://schemas.microsoft.com/office/word/2018/wordml" xmlns:w16du="http://schemas.microsoft.com/office/word/2023/wordml/word16du" xmlns:w16sdtdh="http://schemas.microsoft.com/office/word/2020/wordml/sdtdatahash" xmlns:w16sdtfl="http://schemas.microsoft.com/office/word/2024/wordml/sdtformatlock" xmlns:w16se="http://schemas.microsoft.com/office/word/2015/wordml/symex" xmlns:wpg="http://schemas.microsoft.com/office/word/2010/wordprocessingGroup" xmlns:wpi="http://schemas.microsoft.com/office/word/2010/wordprocessingInk" xmlns:wne="http://schemas.microsoft.com/office/word/2006/wordml" xmlns:wps="http://schemas.microsoft.com/office/word/2010/wordprocessingShape" mc:Ignorable="w14 w15 w16se w16cid w16 w16cex w16sdtdh w16sdtfl w16du wp14">
   <w:abstractNum w:abstractNumId="0" w15:restartNumberingAfterBreak="0">
     <w:nsid w:val="00A99411"/>
     <w:multiLevelType w:val="multilevel"/>
@@ -28029,7 +27958,7 @@
       </w:pPr>
     </w:lvl>
   </w:abstractNum>
-  <w:num w:numId="1">
+  <w:num w:numId="1" w16cid:durableId="795684189">
     <w:abstractNumId w:val="0"/>
     <w:lvlOverride w:ilvl="0">
       <w:startOverride w:val="1"/>
@@ -28059,7 +27988,7 @@
       <w:startOverride w:val="1"/>
     </w:lvlOverride>
   </w:num>
-  <w:num w:numId="2">
+  <w:num w:numId="2" w16cid:durableId="1298299992">
     <w:abstractNumId w:val="1"/>
     <w:lvlOverride w:ilvl="0">
       <w:startOverride w:val="2"/>
@@ -28089,7 +28018,7 @@
       <w:startOverride w:val="2"/>
     </w:lvlOverride>
   </w:num>
-  <w:num w:numId="3">
+  <w:num w:numId="3" w16cid:durableId="1971201689">
     <w:abstractNumId w:val="2"/>
     <w:lvlOverride w:ilvl="0">
       <w:startOverride w:val="3"/>
@@ -28119,7 +28048,7 @@
       <w:startOverride w:val="3"/>
     </w:lvlOverride>
   </w:num>
-  <w:num w:numId="4">
+  <w:num w:numId="4" w16cid:durableId="714962295">
     <w:abstractNumId w:val="3"/>
     <w:lvlOverride w:ilvl="0">
       <w:startOverride w:val="4"/>
@@ -28149,7 +28078,7 @@
       <w:startOverride w:val="4"/>
     </w:lvlOverride>
   </w:num>
-  <w:num w:numId="5">
+  <w:num w:numId="5" w16cid:durableId="288174074">
     <w:abstractNumId w:val="2"/>
     <w:lvlOverride w:ilvl="0">
       <w:startOverride w:val="3"/>
@@ -28179,10 +28108,10 @@
       <w:startOverride w:val="3"/>
     </w:lvlOverride>
   </w:num>
-  <w:num w:numId="6">
+  <w:num w:numId="6" w16cid:durableId="1996302758">
     <w:abstractNumId w:val="4"/>
   </w:num>
-  <w:num w:numId="7">
+  <w:num w:numId="7" w16cid:durableId="1718889361">
     <w:abstractNumId w:val="5"/>
     <w:lvlOverride w:ilvl="0">
       <w:startOverride w:val="6"/>
@@ -28212,7 +28141,7 @@
       <w:startOverride w:val="6"/>
     </w:lvlOverride>
   </w:num>
-  <w:num w:numId="8">
+  <w:num w:numId="8" w16cid:durableId="1495609968">
     <w:abstractNumId w:val="0"/>
     <w:lvlOverride w:ilvl="0">
       <w:startOverride w:val="1"/>
@@ -28242,10 +28171,10 @@
       <w:startOverride w:val="1"/>
     </w:lvlOverride>
   </w:num>
-  <w:num w:numId="9">
+  <w:num w:numId="9" w16cid:durableId="144593150">
     <w:abstractNumId w:val="6"/>
   </w:num>
-  <w:num w:numId="10">
+  <w:num w:numId="10" w16cid:durableId="33967974">
     <w:abstractNumId w:val="7"/>
   </w:num>
   <w:numIdMacAtCleanup w:val="9"/>
@@ -28253,15 +28182,18 @@
 </file>
 
 <file path=word/people.xml><?xml version="1.0" encoding="utf-8"?>
-<w15:people xmlns:wpc="http://schemas.microsoft.com/office/word/2010/wordprocessingCanvas" xmlns:cx="http://schemas.microsoft.com/office/drawing/2014/chartex" xmlns:cx1="http://schemas.microsoft.com/office/drawing/2015/9/8/chartex" xmlns:cx2="http://schemas.microsoft.com/office/drawing/2015/10/21/chartex" xmlns:cx3="http://schemas.microsoft.com/office/drawing/2016/5/9/chartex" xmlns:cx4="http://schemas.microsoft.com/office/drawing/2016/5/10/chartex" xmlns:cx5="http://schemas.microsoft.com/office/drawing/2016/5/11/chartex" xmlns:cx6="http://schemas.microsoft.com/office/drawing/2016/5/12/chartex" xmlns:cx7="http://schemas.microsoft.com/office/drawing/2016/5/13/chartex" xmlns:cx8="http://schemas.microsoft.com/office/drawing/2016/5/14/chartex" xmlns:mc="http://schemas.openxmlformats.org/markup-compatibility/2006" xmlns:aink="http://schemas.microsoft.com/office/drawing/2016/ink" xmlns:am3d="http://schemas.microsoft.com/office/drawing/2017/model3d" xmlns:o="urn:schemas-microsoft-com:office:office" xmlns:r="http://schemas.openxmlformats.org/officeDocument/2006/relationships" xmlns:m="http://schemas.openxmlformats.org/officeDocument/2006/math" xmlns:v="urn:schemas-microsoft-com:vml" xmlns:wp14="http://schemas.microsoft.com/office/word/2010/wordprocessingDrawing" xmlns:wp="http://schemas.openxmlformats.org/drawingml/2006/wordprocessingDrawing" xmlns:w10="urn:schemas-microsoft-com:office:word" xmlns:w="http://schemas.openxmlformats.org/wordprocessingml/2006/main" xmlns:w14="http://schemas.microsoft.com/office/word/2010/wordml" xmlns:w15="http://schemas.microsoft.com/office/word/2012/wordml" xmlns:w16cid="http://schemas.microsoft.com/office/word/2016/wordml/cid" xmlns:w16se="http://schemas.microsoft.com/office/word/2015/wordml/symex" xmlns:wpg="http://schemas.microsoft.com/office/word/2010/wordprocessingGroup" xmlns:wpi="http://schemas.microsoft.com/office/word/2010/wordprocessingInk" xmlns:wne="http://schemas.microsoft.com/office/word/2006/wordml" xmlns:wps="http://schemas.microsoft.com/office/word/2010/wordprocessingShape" mc:Ignorable="w14 w15 w16se w16cid wp14">
+<w15:people xmlns:wpc="http://schemas.microsoft.com/office/word/2010/wordprocessingCanvas" xmlns:cx="http://schemas.microsoft.com/office/drawing/2014/chartex" xmlns:cx1="http://schemas.microsoft.com/office/drawing/2015/9/8/chartex" xmlns:cx2="http://schemas.microsoft.com/office/drawing/2015/10/21/chartex" xmlns:cx3="http://schemas.microsoft.com/office/drawing/2016/5/9/chartex" xmlns:cx4="http://schemas.microsoft.com/office/drawing/2016/5/10/chartex" xmlns:cx5="http://schemas.microsoft.com/office/drawing/2016/5/11/chartex" xmlns:cx6="http://schemas.microsoft.com/office/drawing/2016/5/12/chartex" xmlns:cx7="http://schemas.microsoft.com/office/drawing/2016/5/13/chartex" xmlns:cx8="http://schemas.microsoft.com/office/drawing/2016/5/14/chartex" xmlns:mc="http://schemas.openxmlformats.org/markup-compatibility/2006" xmlns:aink="http://schemas.microsoft.com/office/drawing/2016/ink" xmlns:am3d="http://schemas.microsoft.com/office/drawing/2017/model3d" xmlns:o="urn:schemas-microsoft-com:office:office" xmlns:oel="http://schemas.microsoft.com/office/2019/extlst" xmlns:r="http://schemas.openxmlformats.org/officeDocument/2006/relationships" xmlns:m="http://schemas.openxmlformats.org/officeDocument/2006/math" xmlns:v="urn:schemas-microsoft-com:vml" xmlns:wp14="http://schemas.microsoft.com/office/word/2010/wordprocessingDrawing" xmlns:wp="http://schemas.openxmlformats.org/drawingml/2006/wordprocessingDrawing" xmlns:w10="urn:schemas-microsoft-com:office:word" xmlns:w="http://schemas.openxmlformats.org/wordprocessingml/2006/main" xmlns:w14="http://schemas.microsoft.com/office/word/2010/wordml" xmlns:w15="http://schemas.microsoft.com/office/word/2012/wordml" xmlns:w16cex="http://schemas.microsoft.com/office/word/2018/wordml/cex" xmlns:w16cid="http://schemas.microsoft.com/office/word/2016/wordml/cid" xmlns:w16="http://schemas.microsoft.com/office/word/2018/wordml" xmlns:w16du="http://schemas.microsoft.com/office/word/2023/wordml/word16du" xmlns:w16sdtdh="http://schemas.microsoft.com/office/word/2020/wordml/sdtdatahash" xmlns:w16sdtfl="http://schemas.microsoft.com/office/word/2024/wordml/sdtformatlock" xmlns:w16se="http://schemas.microsoft.com/office/word/2015/wordml/symex" xmlns:wpg="http://schemas.microsoft.com/office/word/2010/wordprocessingGroup" xmlns:wpi="http://schemas.microsoft.com/office/word/2010/wordprocessingInk" xmlns:wne="http://schemas.microsoft.com/office/word/2006/wordml" xmlns:wps="http://schemas.microsoft.com/office/word/2010/wordprocessingShape" mc:Ignorable="w14 w15 w16se w16cid w16 w16cex w16sdtdh w16sdtfl w16du wp14">
   <w15:person w15:author="Stoycho Rusinov">
     <w15:presenceInfo w15:providerId="AD" w15:userId="S-1-5-21-969689788-1387863149-4200522736-1811"/>
+  </w15:person>
+  <w15:person w15:author="Microsoft Office User">
+    <w15:presenceInfo w15:providerId="None" w15:userId="Microsoft Office User"/>
   </w15:person>
 </w15:people>
 </file>
 
 <file path=word/styles.xml><?xml version="1.0" encoding="utf-8"?>
-<w:styles xmlns:mc="http://schemas.openxmlformats.org/markup-compatibility/2006" xmlns:r="http://schemas.openxmlformats.org/officeDocument/2006/relationships" xmlns:w="http://schemas.openxmlformats.org/wordprocessingml/2006/main" xmlns:w14="http://schemas.microsoft.com/office/word/2010/wordml" xmlns:w15="http://schemas.microsoft.com/office/word/2012/wordml" xmlns:w16cid="http://schemas.microsoft.com/office/word/2016/wordml/cid" xmlns:w16se="http://schemas.microsoft.com/office/word/2015/wordml/symex" mc:Ignorable="w14 w15 w16se w16cid">
+<w:styles xmlns:mc="http://schemas.openxmlformats.org/markup-compatibility/2006" xmlns:r="http://schemas.openxmlformats.org/officeDocument/2006/relationships" xmlns:w="http://schemas.openxmlformats.org/wordprocessingml/2006/main" xmlns:w14="http://schemas.microsoft.com/office/word/2010/wordml" xmlns:w15="http://schemas.microsoft.com/office/word/2012/wordml" xmlns:w16cex="http://schemas.microsoft.com/office/word/2018/wordml/cex" xmlns:w16cid="http://schemas.microsoft.com/office/word/2016/wordml/cid" xmlns:w16="http://schemas.microsoft.com/office/word/2018/wordml" xmlns:w16du="http://schemas.microsoft.com/office/word/2023/wordml/word16du" xmlns:w16sdtdh="http://schemas.microsoft.com/office/word/2020/wordml/sdtdatahash" xmlns:w16sdtfl="http://schemas.microsoft.com/office/word/2024/wordml/sdtformatlock" xmlns:w16se="http://schemas.microsoft.com/office/word/2015/wordml/symex" mc:Ignorable="w14 w15 w16se w16cid w16 w16cex w16sdtdh w16sdtfl w16du">
   <w:docDefaults>
     <w:rPrDefault>
       <w:rPr>
@@ -28275,7 +28207,7 @@
     </w:rPrDefault>
     <w:pPrDefault/>
   </w:docDefaults>
-  <w:latentStyles w:defLockedState="0" w:defUIPriority="99" w:defSemiHidden="0" w:defUnhideWhenUsed="0" w:defQFormat="0" w:count="375">
+  <w:latentStyles w:defLockedState="0" w:defUIPriority="99" w:defSemiHidden="0" w:defUnhideWhenUsed="0" w:defQFormat="0" w:count="376">
     <w:lsdException w:name="Normal" w:uiPriority="0" w:qFormat="1"/>
     <w:lsdException w:name="heading 1" w:uiPriority="9" w:qFormat="1"/>
     <w:lsdException w:name="heading 2" w:semiHidden="1" w:uiPriority="9" w:unhideWhenUsed="1" w:qFormat="1"/>
@@ -28651,6 +28583,7 @@
     <w:lsdException w:name="Smart Hyperlink" w:semiHidden="1" w:unhideWhenUsed="1"/>
     <w:lsdException w:name="Hashtag" w:semiHidden="1" w:unhideWhenUsed="1"/>
     <w:lsdException w:name="Unresolved Mention" w:semiHidden="1" w:unhideWhenUsed="1"/>
+    <w:lsdException w:name="Smart Link" w:semiHidden="1" w:unhideWhenUsed="1"/>
   </w:latentStyles>
   <w:style w:type="paragraph" w:default="1" w:styleId="Normal">
     <w:name w:val="Normal"/>
@@ -28762,9 +28695,6 @@
         <w:insideV w:val="none" w:sz="0" w:space="0" w:color="auto"/>
       </w:tblBorders>
     </w:tblPr>
-    <w:tcPr>
-      <w:shd w:val="clear" w:color="auto" w:fill="auto"/>
-    </w:tcPr>
     <w:tblStylePr w:type="firstRow">
       <w:rPr>
         <w:color w:val="auto"/>
@@ -29588,6 +29518,13 @@
   <w:style w:type="character" w:customStyle="1" w:styleId="NormalTok">
     <w:name w:val="NormalTok"/>
   </w:style>
+  <w:style w:type="paragraph" w:styleId="Revision">
+    <w:name w:val="Revision"/>
+    <w:hidden/>
+    <w:uiPriority w:val="99"/>
+    <w:semiHidden/>
+    <w:rsid w:val="00B13E39"/>
+  </w:style>
 </w:styles>
 </file>
 

</xml_diff>